<commit_message>
docs(pedagogy): align M1-M5 student guides with production scenarios
Co-authored-by: Cursor <cursoragent@cursor.com>
</commit_message>
<xml_diff>
--- a/TECWMS_GUIDE_M4_M5.docx
+++ b/TECWMS_GUIDE_M4_M5.docx
@@ -22,7 +22,7 @@
       </w:pPr>
       <w:r>
         <w:rPr/>
-        <w:t xml:space="preserve"> @media print {   @page {     size: A4;     margin: 2.5cm;     @bottom-center {       content: "Collège de la Concorde · TEC.WMS · Simulateur pédagogique ERP/WMS · juillet 2026";       font-size: 9pt;       color: #444;     }     @bottom-right {       content: counter(page);       font-size: 9pt;       color: #444;     }   } } .page-break {   page-break-after: always;   break-after: page; } .cover-page {   text-align: center;   padding-top: 6cm;   min-height: 24cm; } .cover-page .brand {   font-size: 2.4em;   font-weight: 700;   letter-spacing: 0.08em;   margin-bottom: 1.2em; } .cover-page .title-block h1 {   font-size: 1.6em;   font-weight: 600;   line-height: 1.4;   margin: 0.3em 0;   border: none; } .cover-page .subtitle-block {   margin-top: 4cm;   font-size: 1.1em;   line-height: 1.6;   color: #333; } .cover-page .meta {   margin-top: 3cm;   font-size: 0.95em;   color: #555; } .doc-footer {   margin-top: 2em;   padding-top: 0.8em;   border-top: 1px solid #ccc;   font-size: 0.85em;   color: #555;   text-align: center; } .checklist-page table {   width: 100%;   border-collapse: collapse; } .checklist-page td {   padding: 0.6em 0.4em;   border-bottom: 1px solid #ddd;   vertical-align: top; } .checklist-page td:first-child {   width: 2em;   font-size: 1.2em; } </w:t>
+        <w:t xml:space="preserve"> .page-break {   page-break-after: always;   break-after: page; } .cover-page {   text-align: center;   padding-top: 6cm;   min-height: 24cm; } .cover-page .brand {   font-size: 2.4em;   font-weight: 700;   letter-spacing: 0.08em;   margin-bottom: 1.2em; } .cover-page .title-block h1 {   font-size: 1.6em;   font-weight: 600;   line-height: 1.4;   margin: 0.3em 0;   border: none; } .cover-page .subtitle-block {   margin-top: 4cm;   font-size: 1.1em;   line-height: 1.6;   color: #333; } .cover-page .meta {   margin-top: 3cm;   font-size: 0.95em;   color: #555; } .doc-footer {   margin-top: 2em;   padding-top: 0.8em;   border-top: 1px solid #ccc;   font-size: 0.85em;   color: #555;   text-align: center; } .checklist-page table {   width: 100%;   border-collapse: collapse; } .checklist-page td {   padding: 0.6em 0.4em;   border-bottom: 1px solid #ddd;   vertical-align: top; } .checklist-page td:first-child {   width: 2em;   font-size: 1.2em; } </w:t>
       </w:r>
     </w:p>
     <w:p>
@@ -76,28 +76,16 @@
       </w:r>
       <w:r>
         <w:rPr/>
-        <w:br w:type="textWrapping"/>
-      </w:r>
-      <w:r>
-        <w:rPr/>
-        <w:t xml:space="preserve">Simulateur pédagogique ERP/WMS</w:t>
-      </w:r>
-    </w:p>
-    <w:p>
-      <w:pPr>
-        <w:spacing w:lineRule="auto"/>
-      </w:pPr>
-      <w:r>
-        <w:rPr/>
-        <w:t xml:space="preserve">Scénarios SCN-012 à SCN-017 · Seuil de réussite : 70 / 100</w:t>
-      </w:r>
-      <w:r>
-        <w:rPr/>
-        <w:br w:type="textWrapping"/>
-      </w:r>
-      <w:r>
-        <w:rPr/>
-        <w:t xml:space="preserve">Version juillet 2026 · Document étudiant</w:t>
+        <w:t xml:space="preserve"> Simulateur pédagogique ERP/WMS</w:t>
+      </w:r>
+    </w:p>
+    <w:p>
+      <w:pPr>
+        <w:spacing w:lineRule="auto"/>
+      </w:pPr>
+      <w:r>
+        <w:rPr/>
+        <w:t xml:space="preserve">Scénarios SCN-012 à SCN-017 · Seuil de réussite : 70 / 100 Version mise à jour — juillet 2026 · Document étudiant</w:t>
       </w:r>
     </w:p>
     <w:p>
@@ -282,11 +270,7 @@
       </w:r>
       <w:r>
         <w:rPr/>
-        <w:t xml:space="preserve"> TEC.LOG — Simulation WMS intégrée</w:t>
-      </w:r>
-      <w:r>
-        <w:rPr/>
-        <w:br w:type="textWrapping"/>
+        <w:t xml:space="preserve"> TEC.LOG — Simulation WMS intégrée </w:t>
       </w:r>
       <w:r>
         <w:rPr>
@@ -296,11 +280,7 @@
       </w:r>
       <w:r>
         <w:rPr/>
-        <w:t xml:space="preserve"> étudiants en préparation à l'évaluation</w:t>
-      </w:r>
-      <w:r>
-        <w:rPr/>
-        <w:br w:type="textWrapping"/>
+        <w:t xml:space="preserve"> étudiants en préparation à l'évaluation </w:t>
       </w:r>
       <w:r>
         <w:rPr>
@@ -310,11 +290,7 @@
       </w:r>
       <w:r>
         <w:rPr/>
-        <w:t xml:space="preserve"> SCN-012 à SCN-017</w:t>
-      </w:r>
-      <w:r>
-        <w:rPr/>
-        <w:br w:type="textWrapping"/>
+        <w:t xml:space="preserve"> SCN-012 à SCN-017 </w:t>
       </w:r>
       <w:r>
         <w:rPr>
@@ -324,11 +300,7 @@
       </w:r>
       <w:r>
         <w:rPr/>
-        <w:t xml:space="preserve"> 70 / 100 par scénario</w:t>
-      </w:r>
-      <w:r>
-        <w:rPr/>
-        <w:br w:type="textWrapping"/>
+        <w:t xml:space="preserve"> 70 / 100 par scénario </w:t>
       </w:r>
       <w:r>
         <w:rPr>
@@ -338,7 +310,7 @@
       </w:r>
       <w:r>
         <w:rPr/>
-        <w:t xml:space="preserve"> juillet 2026</w:t>
+        <w:t xml:space="preserve"> mise à jour — juillet 2026</w:t>
       </w:r>
     </w:p>
     <w:p>
@@ -1141,11 +1113,7 @@
       </w:r>
       <w:r>
         <w:rPr/>
-        <w:t xml:space="preserve"> — données portefeuille fournies par le tour de contrôle analytique (pas de transaction physique).</w:t>
-      </w:r>
-      <w:r>
-        <w:rPr/>
-        <w:br w:type="textWrapping"/>
+        <w:t xml:space="preserve"> — données portefeuille fournies par le tour de contrôle analytique (pas de transaction physique). </w:t>
       </w:r>
       <w:r>
         <w:rPr>
@@ -1155,17 +1123,17 @@
       </w:r>
       <w:r>
         <w:rPr/>
-        <w:t xml:space="preserve"> — KPI issus de </w:t>
+        <w:t xml:space="preserve"> — résultats et KPI issus de </w:t>
       </w:r>
       <w:r>
         <w:rPr>
           <w:b/>
         </w:rPr>
-        <w:t xml:space="preserve">votre run</w:t>
-      </w:r>
-      <w:r>
-        <w:rPr/>
-        <w:t xml:space="preserve"> (ledger / snapshot).  </w:t>
+        <w:t xml:space="preserve">votre propre session de simulation</w:t>
+      </w:r>
+      <w:r>
+        <w:rPr/>
+        <w:t xml:space="preserve">.</w:t>
       </w:r>
     </w:p>
     <w:p>
@@ -1178,7 +1146,21 @@
         <w:rPr>
           <w:b/>
         </w:rPr>
-        <w:t xml:space="preserve">Les KPI du Module 5 proviennent de votre session. Ne recopiez pas les valeurs du Module 4, sauf si elles apparaissent réellement dans votre snapshot.</w:t>
+        <w:t xml:space="preserve">Dans le Module 5, les résultats présentés dans le panneau de décision proviennent de votre propre session. Vous devez utiliser ces données pour expliquer la situation et formuler une décision professionnelle.</w:t>
+      </w:r>
+      <w:r>
+        <w:rPr/>
+        <w:t xml:space="preserve">Le panneau présente des </w:t>
+      </w:r>
+      <w:r>
+        <w:rPr>
+          <w:b/>
+        </w:rPr>
+        <w:t xml:space="preserve">preuves</w:t>
+      </w:r>
+      <w:r>
+        <w:rPr/>
+        <w:t xml:space="preserve">. C’est à vous de produire le diagnostic. Le système ne fournit pas la conclusion finale. Des réponses courtes sont acceptées lorsque le raisonnement est complet.</w:t>
       </w:r>
     </w:p>
     <w:p>
@@ -1335,7 +1317,7 @@
             </w:pPr>
             <w:r>
               <w:rPr/>
-              <w:t xml:space="preserve">Exécuter → Vérifier → Corriger si nécessaire → Décider</w:t>
+              <w:t xml:space="preserve">Exécuter → Vérifier → Interpréter → Décider</w:t>
             </w:r>
           </w:p>
         </w:tc>
@@ -1361,7 +1343,7 @@
               <w:rPr>
                 <w:b/>
               </w:rPr>
-              <w:t xml:space="preserve">Source KPI</w:t>
+              <w:t xml:space="preserve">Source</w:t>
             </w:r>
           </w:p>
         </w:tc>
@@ -1399,7 +1381,7 @@
             </w:pPr>
             <w:r>
               <w:rPr/>
-              <w:t xml:space="preserve">Snapshot de votre session</w:t>
+              <w:t xml:space="preserve">Résultats de votre session</w:t>
             </w:r>
           </w:p>
         </w:tc>
@@ -1463,7 +1445,7 @@
             </w:pPr>
             <w:r>
               <w:rPr/>
-              <w:t xml:space="preserve">Transactions ops du run</w:t>
+              <w:t xml:space="preserve">Opérations exécutées dans le run</w:t>
             </w:r>
           </w:p>
         </w:tc>
@@ -1489,45 +1471,45 @@
               <w:rPr>
                 <w:b/>
               </w:rPr>
-              <w:t xml:space="preserve">Niveau décision</w:t>
-            </w:r>
-          </w:p>
-        </w:tc>
-        <w:tc>
-          <w:tcPr>
-            <w:tcBorders>
-              <w:top w:val="single" w:sz="1" w:space="0" w:color="000000"/>
-              <w:bottom w:val="single" w:sz="1" w:space="0" w:color="000000"/>
-              <w:left w:val="single" w:sz="1" w:space="0" w:color="000000"/>
-              <w:right w:val="single" w:sz="1" w:space="0" w:color="000000"/>
-            </w:tcBorders>
-          </w:tcPr>
-          <w:p>
-            <w:pPr>
-              <w:spacing w:lineRule="auto"/>
-            </w:pPr>
-            <w:r>
-              <w:rPr/>
-              <w:t xml:space="preserve">Analytique (politique / S&amp;OP)</w:t>
-            </w:r>
-          </w:p>
-        </w:tc>
-        <w:tc>
-          <w:tcPr>
-            <w:tcBorders>
-              <w:top w:val="single" w:sz="1" w:space="0" w:color="000000"/>
-              <w:bottom w:val="single" w:sz="1" w:space="0" w:color="000000"/>
-              <w:left w:val="single" w:sz="1" w:space="0" w:color="000000"/>
-              <w:right w:val="single" w:sz="1" w:space="0" w:color="000000"/>
-            </w:tcBorders>
-          </w:tcPr>
-          <w:p>
-            <w:pPr>
-              <w:spacing w:lineRule="auto"/>
-            </w:pPr>
-            <w:r>
-              <w:rPr/>
-              <w:t xml:space="preserve">Tactique (015/016) ou stratégique (017)</w:t>
+              <w:t xml:space="preserve">Boutons</w:t>
+            </w:r>
+          </w:p>
+        </w:tc>
+        <w:tc>
+          <w:tcPr>
+            <w:tcBorders>
+              <w:top w:val="single" w:sz="1" w:space="0" w:color="000000"/>
+              <w:bottom w:val="single" w:sz="1" w:space="0" w:color="000000"/>
+              <w:left w:val="single" w:sz="1" w:space="0" w:color="000000"/>
+              <w:right w:val="single" w:sz="1" w:space="0" w:color="000000"/>
+            </w:tcBorders>
+          </w:tcPr>
+          <w:p>
+            <w:pPr>
+              <w:spacing w:lineRule="auto"/>
+            </w:pPr>
+            <w:r>
+              <w:rPr/>
+              <w:t xml:space="preserve">Valider l’analyse</w:t>
+            </w:r>
+          </w:p>
+        </w:tc>
+        <w:tc>
+          <w:tcPr>
+            <w:tcBorders>
+              <w:top w:val="single" w:sz="1" w:space="0" w:color="000000"/>
+              <w:bottom w:val="single" w:sz="1" w:space="0" w:color="000000"/>
+              <w:left w:val="single" w:sz="1" w:space="0" w:color="000000"/>
+              <w:right w:val="single" w:sz="1" w:space="0" w:color="000000"/>
+            </w:tcBorders>
+          </w:tcPr>
+          <w:p>
+            <w:pPr>
+              <w:spacing w:lineRule="auto"/>
+            </w:pPr>
+            <w:r>
+              <w:rPr/>
+              <w:t xml:space="preserve">Valider les résultats · Soumettre la décision</w:t>
             </w:r>
           </w:p>
         </w:tc>
@@ -1553,6 +1535,70 @@
               <w:rPr>
                 <w:b/>
               </w:rPr>
+              <w:t xml:space="preserve">Niveau décision</w:t>
+            </w:r>
+          </w:p>
+        </w:tc>
+        <w:tc>
+          <w:tcPr>
+            <w:tcBorders>
+              <w:top w:val="single" w:sz="1" w:space="0" w:color="000000"/>
+              <w:bottom w:val="single" w:sz="1" w:space="0" w:color="000000"/>
+              <w:left w:val="single" w:sz="1" w:space="0" w:color="000000"/>
+              <w:right w:val="single" w:sz="1" w:space="0" w:color="000000"/>
+            </w:tcBorders>
+          </w:tcPr>
+          <w:p>
+            <w:pPr>
+              <w:spacing w:lineRule="auto"/>
+            </w:pPr>
+            <w:r>
+              <w:rPr/>
+              <w:t xml:space="preserve">Analytique (politique / S&amp;OP)</w:t>
+            </w:r>
+          </w:p>
+        </w:tc>
+        <w:tc>
+          <w:tcPr>
+            <w:tcBorders>
+              <w:top w:val="single" w:sz="1" w:space="0" w:color="000000"/>
+              <w:bottom w:val="single" w:sz="1" w:space="0" w:color="000000"/>
+              <w:left w:val="single" w:sz="1" w:space="0" w:color="000000"/>
+              <w:right w:val="single" w:sz="1" w:space="0" w:color="000000"/>
+            </w:tcBorders>
+          </w:tcPr>
+          <w:p>
+            <w:pPr>
+              <w:spacing w:lineRule="auto"/>
+            </w:pPr>
+            <w:r>
+              <w:rPr/>
+              <w:t xml:space="preserve">Tactique (015/016) ou stratégique (017)</w:t>
+            </w:r>
+          </w:p>
+        </w:tc>
+      </w:tr>
+      <w:tr>
+        <w:trPr>
+          <w:cantSplit/>
+        </w:trPr>
+        <w:tc>
+          <w:tcPr>
+            <w:tcBorders>
+              <w:top w:val="single" w:sz="1" w:space="0" w:color="000000"/>
+              <w:bottom w:val="single" w:sz="1" w:space="0" w:color="000000"/>
+              <w:left w:val="single" w:sz="1" w:space="0" w:color="000000"/>
+              <w:right w:val="single" w:sz="1" w:space="0" w:color="000000"/>
+            </w:tcBorders>
+          </w:tcPr>
+          <w:p>
+            <w:pPr>
+              <w:spacing w:lineRule="auto"/>
+            </w:pPr>
+            <w:r>
+              <w:rPr>
+                <w:b/>
+              </w:rPr>
               <w:t xml:space="preserve">Seuil</w:t>
             </w:r>
           </w:p>
@@ -1603,11 +1649,6 @@
       </w:pPr>
       <w:r>
         <w:rPr/>
-      </w:r>
-    </w:p>
-    <w:p>
-      <w:r>
-        <w:br w:type="page"/>
       </w:r>
     </w:p>
     <w:p>
@@ -1683,11 +1724,7 @@
       </w:r>
       <w:r>
         <w:rPr/>
-        <w:t xml:space="preserve"> analyste stock / revue CFO</w:t>
-      </w:r>
-      <w:r>
-        <w:rPr/>
-        <w:br w:type="textWrapping"/>
+        <w:t xml:space="preserve"> analyste stock / revue CFO </w:t>
       </w:r>
       <w:r>
         <w:rPr>
@@ -1735,15 +1772,7 @@
       </w:pPr>
       <w:r>
         <w:rPr/>
-        <w:t xml:space="preserve">Formule : consommation ÷ stock moyen. Placer le résultat dans la bande 4–12× (ou hors bande).</w:t>
-      </w:r>
-      <w:r>
-        <w:rPr/>
-        <w:br w:type="textWrapping"/>
-      </w:r>
-      <w:r>
-        <w:rPr/>
-        <w:t xml:space="preserve">Ne pas classer une rotation dans la bande normale comme un surstock.</w:t>
+        <w:t xml:space="preserve">Formule : consommation ÷ stock moyen. Placer le résultat dans la bande 4–12× (ou hors bande). Ne pas classer une rotation dans la bande normale comme un surstock.</w:t>
       </w:r>
     </w:p>
     <w:p>
@@ -1785,7 +1814,7 @@
       </w:pPr>
       <w:r>
         <w:rPr/>
-        <w:t xml:space="preserve">Classification cohérente du taux  </w:t>
+        <w:t xml:space="preserve">Classification cohérente du taux</w:t>
       </w:r>
     </w:p>
     <w:p>
@@ -1798,7 +1827,7 @@
       </w:pPr>
       <w:r>
         <w:rPr/>
-        <w:t xml:space="preserve">Maintien (ou absence de réduction globale)  </w:t>
+        <w:t xml:space="preserve">Maintien (ou absence de réduction globale)</w:t>
       </w:r>
     </w:p>
     <w:p>
@@ -1884,7 +1913,7 @@
       </w:pPr>
       <w:r>
         <w:rPr/>
-        <w:t xml:space="preserve">Classer 6× (bande normale) comme surstock  </w:t>
+        <w:t xml:space="preserve">Classer 6× (bande normale) comme surstock</w:t>
       </w:r>
     </w:p>
     <w:p>
@@ -1897,7 +1926,7 @@
       </w:pPr>
       <w:r>
         <w:rPr/>
-        <w:t xml:space="preserve">Liquidation / destock global  </w:t>
+        <w:t xml:space="preserve">Liquidation / destock global</w:t>
       </w:r>
     </w:p>
     <w:p>
@@ -1935,11 +1964,7 @@
       </w:r>
       <w:r>
         <w:rPr/>
-        <w:t xml:space="preserve"> responsable service client / qualité</w:t>
-      </w:r>
-      <w:r>
-        <w:rPr/>
-        <w:br w:type="textWrapping"/>
+        <w:t xml:space="preserve"> responsable service client / qualité </w:t>
       </w:r>
       <w:r>
         <w:rPr>
@@ -2029,7 +2054,7 @@
       </w:pPr>
       <w:r>
         <w:rPr/>
-        <w:t xml:space="preserve">OTIF classé correctement  </w:t>
+        <w:t xml:space="preserve">OTIF classé correctement</w:t>
       </w:r>
     </w:p>
     <w:p>
@@ -2042,7 +2067,7 @@
       </w:pPr>
       <w:r>
         <w:rPr/>
-        <w:t xml:space="preserve">Erreurs acceptables mais à améliorer / surveiller  </w:t>
+        <w:t xml:space="preserve">Erreurs acceptables mais à améliorer / surveiller</w:t>
       </w:r>
     </w:p>
     <w:p>
@@ -2055,7 +2080,7 @@
       </w:pPr>
       <w:r>
         <w:rPr/>
-        <w:t xml:space="preserve">Action qualité  </w:t>
+        <w:t xml:space="preserve">Action qualité</w:t>
       </w:r>
     </w:p>
     <w:p>
@@ -2091,7 +2116,7 @@
       </w:pPr>
       <w:r>
         <w:rPr/>
-        <w:t xml:space="preserve">OTIF 95 % classé faible  </w:t>
+        <w:t xml:space="preserve">OTIF 95 % classé faible</w:t>
       </w:r>
     </w:p>
     <w:p>
@@ -2104,7 +2129,7 @@
       </w:pPr>
       <w:r>
         <w:rPr/>
-        <w:t xml:space="preserve">Erreurs 4 % présentées comme excellentes  </w:t>
+        <w:t xml:space="preserve">Erreurs 4 % présentées comme excellentes</w:t>
       </w:r>
     </w:p>
     <w:p>
@@ -2117,7 +2142,7 @@
       </w:pPr>
       <w:r>
         <w:rPr/>
-        <w:t xml:space="preserve">Destock comme levier principal  </w:t>
+        <w:t xml:space="preserve">Destock comme levier principal</w:t>
       </w:r>
     </w:p>
     <w:p>
@@ -2155,11 +2180,7 @@
       </w:r>
       <w:r>
         <w:rPr/>
-        <w:t xml:space="preserve"> comité S&amp;OP — une seule initiative financée</w:t>
-      </w:r>
-      <w:r>
-        <w:rPr/>
-        <w:br w:type="textWrapping"/>
+        <w:t xml:space="preserve"> comité S&amp;OP — une seule initiative financée </w:t>
       </w:r>
       <w:r>
         <w:rPr>
@@ -2249,7 +2270,7 @@
       </w:pPr>
       <w:r>
         <w:rPr/>
-        <w:t xml:space="preserve">Lecture globale stable  </w:t>
+        <w:t xml:space="preserve">Lecture globale stable</w:t>
       </w:r>
     </w:p>
     <w:p>
@@ -2262,7 +2283,7 @@
       </w:pPr>
       <w:r>
         <w:rPr/>
-        <w:t xml:space="preserve">Une priorité claire  </w:t>
+        <w:t xml:space="preserve">Une priorité claire</w:t>
       </w:r>
     </w:p>
     <w:p>
@@ -2275,7 +2296,7 @@
       </w:pPr>
       <w:r>
         <w:rPr/>
-        <w:t xml:space="preserve">Compromis explicite  </w:t>
+        <w:t xml:space="preserve">Compromis explicite</w:t>
       </w:r>
     </w:p>
     <w:p>
@@ -2311,7 +2332,7 @@
       </w:pPr>
       <w:r>
         <w:rPr/>
-        <w:t xml:space="preserve">Liste de souhaits sans priorité  </w:t>
+        <w:t xml:space="preserve">Liste de souhaits sans priorité</w:t>
       </w:r>
     </w:p>
     <w:p>
@@ -2324,7 +2345,7 @@
       </w:pPr>
       <w:r>
         <w:rPr/>
-        <w:t xml:space="preserve">Aucun compromis  </w:t>
+        <w:t xml:space="preserve">Aucun compromis</w:t>
       </w:r>
     </w:p>
     <w:p>
@@ -2337,7 +2358,7 @@
       </w:pPr>
       <w:r>
         <w:rPr/>
-        <w:t xml:space="preserve">Aucun horizon  </w:t>
+        <w:t xml:space="preserve">Aucun horizon</w:t>
       </w:r>
     </w:p>
     <w:p>
@@ -2354,11 +2375,6 @@
       </w:r>
     </w:p>
     <w:p>
-      <w:r>
-        <w:br w:type="page"/>
-      </w:r>
-    </w:p>
-    <w:p>
       <w:pPr>
         <w:pStyle w:val="Heading1"/>
         <w:spacing w:lineRule="auto"/>
@@ -2382,7 +2398,7 @@
         <w:rPr>
           <w:b/>
         </w:rPr>
-        <w:t xml:space="preserve">Exécuter → Vérifier → Corriger si nécessaire → Décider</w:t>
+        <w:t xml:space="preserve">Exécuter → Vérifier → Interpréter → Décider</w:t>
       </w:r>
       <w:r>
         <w:rPr/>
@@ -2390,17 +2406,130 @@
       </w:r>
       <w:r>
         <w:rPr/>
-        <w:t xml:space="preserve">KPI = </w:t>
+        <w:t xml:space="preserve">Après les opérations, vous </w:t>
       </w:r>
       <w:r>
         <w:rPr>
           <w:b/>
         </w:rPr>
-        <w:t xml:space="preserve">snapshot de votre session</w:t>
-      </w:r>
-      <w:r>
-        <w:rPr/>
-        <w:t xml:space="preserve">.</w:t>
+        <w:t xml:space="preserve">validez les résultats</w:t>
+      </w:r>
+      <w:r>
+        <w:rPr/>
+        <w:t xml:space="preserve">, puis vous </w:t>
+      </w:r>
+      <w:r>
+        <w:rPr>
+          <w:b/>
+        </w:rPr>
+        <w:t xml:space="preserve">soumettez la décision</w:t>
+      </w:r>
+      <w:r>
+        <w:rPr/>
+        <w:t xml:space="preserve">. Les données du panneau de décision viennent de </w:t>
+      </w:r>
+      <w:r>
+        <w:rPr>
+          <w:b/>
+        </w:rPr>
+        <w:t xml:space="preserve">votre session</w:t>
+      </w:r>
+      <w:r>
+        <w:rPr/>
+        <w:t xml:space="preserve"> — pas du portefeuille M4.</w:t>
+      </w:r>
+    </w:p>
+    <w:p>
+      <w:pPr>
+        <w:spacing w:lineRule="auto"/>
+      </w:pPr>
+      <w:r>
+        <w:rPr/>
+        <w:t xml:space="preserve">Dans le Module 5, les résultats présentés dans le panneau de décision proviennent de votre propre session. Vous devez utiliser ces données pour expliquer la situation et formuler une décision professionnelle.</w:t>
+      </w:r>
+    </w:p>
+    <w:p>
+      <w:pPr>
+        <w:numPr>
+          <w:ilvl w:val="0"/>
+          <w:numId w:val="9"/>
+        </w:numPr>
+        <w:spacing w:lineRule="auto"/>
+      </w:pPr>
+      <w:r>
+        <w:rPr/>
+        <w:t xml:space="preserve">Le panneau présente des </w:t>
+      </w:r>
+      <w:r>
+        <w:rPr>
+          <w:b/>
+        </w:rPr>
+        <w:t xml:space="preserve">preuves</w:t>
+      </w:r>
+      <w:r>
+        <w:rPr/>
+        <w:t xml:space="preserve"> opérationnelles et des indicateurs.</w:t>
+      </w:r>
+    </w:p>
+    <w:p>
+      <w:pPr>
+        <w:numPr>
+          <w:ilvl w:val="0"/>
+          <w:numId w:val="9"/>
+        </w:numPr>
+        <w:spacing w:lineRule="auto"/>
+      </w:pPr>
+      <w:r>
+        <w:rPr>
+          <w:b/>
+        </w:rPr>
+        <w:t xml:space="preserve">Vous</w:t>
+      </w:r>
+      <w:r>
+        <w:rPr/>
+        <w:t xml:space="preserve"> produisez le diagnostic et la décision.</w:t>
+      </w:r>
+    </w:p>
+    <w:p>
+      <w:pPr>
+        <w:numPr>
+          <w:ilvl w:val="0"/>
+          <w:numId w:val="9"/>
+        </w:numPr>
+        <w:spacing w:lineRule="auto"/>
+      </w:pPr>
+      <w:r>
+        <w:rPr/>
+        <w:t xml:space="preserve">Le système </w:t>
+      </w:r>
+      <w:r>
+        <w:rPr>
+          <w:b/>
+        </w:rPr>
+        <w:t xml:space="preserve">ne déclare pas</w:t>
+      </w:r>
+      <w:r>
+        <w:rPr/>
+        <w:t xml:space="preserve"> la conclusion finale à votre place.</w:t>
+      </w:r>
+    </w:p>
+    <w:p>
+      <w:pPr>
+        <w:numPr>
+          <w:ilvl w:val="0"/>
+          <w:numId w:val="9"/>
+        </w:numPr>
+        <w:spacing w:lineRule="auto"/>
+      </w:pPr>
+      <w:r>
+        <w:rPr>
+          <w:b/>
+        </w:rPr>
+        <w:t xml:space="preserve">2 à 3 phrases</w:t>
+      </w:r>
+      <w:r>
+        <w:rPr/>
+        <w:t xml:space="preserve"> suffisent souvent si le raisonnement est complet (4 à 6 pour SCN-017).</w:t>
       </w:r>
     </w:p>
     <w:p>
@@ -2410,13 +2539,23 @@
       </w:pPr>
       <w:r>
         <w:rPr/>
-        <w:t xml:space="preserve">SCN-015 — Cycle nominal (décision tactique)</w:t>
-      </w:r>
-    </w:p>
-    <w:p>
-      <w:pPr>
-        <w:spacing w:lineRule="auto"/>
-      </w:pPr>
+        <w:t xml:space="preserve">SCN-015 — Décision tactique à partir d’un cycle nominal</w:t>
+      </w:r>
+    </w:p>
+    <w:p>
+      <w:pPr>
+        <w:spacing w:lineRule="auto"/>
+      </w:pPr>
+      <w:r>
+        <w:rPr>
+          <w:b/>
+        </w:rPr>
+        <w:t xml:space="preserve">Niveau :</w:t>
+      </w:r>
+      <w:r>
+        <w:rPr/>
+        <w:t xml:space="preserve"> Décision tactique </w:t>
+      </w:r>
       <w:r>
         <w:rPr>
           <w:b/>
@@ -2425,7 +2564,7 @@
       </w:r>
       <w:r>
         <w:rPr/>
-        <w:t xml:space="preserve"> 2–3 phrases</w:t>
+        <w:t xml:space="preserve"> 2 à 3 phrases suffisent si le raisonnement est complet.</w:t>
       </w:r>
     </w:p>
     <w:p>
@@ -2435,16 +2574,55 @@
       </w:pPr>
       <w:r>
         <w:rPr/>
-        <w:t xml:space="preserve">Ce que vous observez</w:t>
-      </w:r>
-    </w:p>
-    <w:p>
-      <w:pPr>
-        <w:spacing w:lineRule="auto"/>
-      </w:pPr>
-      <w:r>
-        <w:rPr/>
-        <w:t xml:space="preserve">Preuves du run (réception, putaway, comptage, réappro, KPI).</w:t>
+        <w:t xml:space="preserve">Ce que le panneau peut afficher</w:t>
+      </w:r>
+    </w:p>
+    <w:p>
+      <w:pPr>
+        <w:spacing w:lineRule="auto"/>
+      </w:pPr>
+      <w:r>
+        <w:rPr/>
+        <w:t xml:space="preserve">État des opérations · réception · rangement · variance ouverte · stock final · minimum · maximum · quantité de réapprovisionnement </w:t>
+      </w:r>
+      <w:r>
+        <w:rPr>
+          <w:b/>
+        </w:rPr>
+        <w:t xml:space="preserve">Q</w:t>
+      </w:r>
+      <w:r>
+        <w:rPr/>
+        <w:t xml:space="preserve"> · KPI sélectionné.</w:t>
+      </w:r>
+    </w:p>
+    <w:p>
+      <w:pPr>
+        <w:spacing w:lineRule="auto"/>
+      </w:pPr>
+      <w:r>
+        <w:rPr/>
+        <w:t xml:space="preserve">Ces faits sont des </w:t>
+      </w:r>
+      <w:r>
+        <w:rPr>
+          <w:b/>
+        </w:rPr>
+        <w:t xml:space="preserve">preuves</w:t>
+      </w:r>
+      <w:r>
+        <w:rPr/>
+        <w:t xml:space="preserve">. Le panneau </w:t>
+      </w:r>
+      <w:r>
+        <w:rPr>
+          <w:b/>
+        </w:rPr>
+        <w:t xml:space="preserve">ne déclare pas</w:t>
+      </w:r>
+      <w:r>
+        <w:rPr/>
+        <w:t xml:space="preserve"> le cycle « conforme » pour vous : c’est à vous de déterminer la conformité à partir des opérations et du stock.</w:t>
       </w:r>
     </w:p>
     <w:p>
@@ -2459,12 +2637,83 @@
     </w:p>
     <w:p>
       <w:pPr>
-        <w:spacing w:lineRule="auto"/>
-      </w:pPr>
-      <w:r>
-        <w:rPr/>
-        <w:t xml:space="preserve">Un cycle conforme peut aboutir à </w:t>
-      </w:r>
+        <w:numPr>
+          <w:ilvl w:val="0"/>
+          <w:numId w:val="10"/>
+        </w:numPr>
+        <w:spacing w:lineRule="auto"/>
+      </w:pPr>
+      <w:r>
+        <w:rPr/>
+        <w:t xml:space="preserve">Vérifier les opérations (réception, rangement, variance).</w:t>
+      </w:r>
+    </w:p>
+    <w:p>
+      <w:pPr>
+        <w:numPr>
+          <w:ilvl w:val="0"/>
+          <w:numId w:val="10"/>
+        </w:numPr>
+        <w:spacing w:lineRule="auto"/>
+      </w:pPr>
+      <w:r>
+        <w:rPr/>
+        <w:t xml:space="preserve">Comparer le stock final au minimum.</w:t>
+      </w:r>
+    </w:p>
+    <w:p>
+      <w:pPr>
+        <w:numPr>
+          <w:ilvl w:val="0"/>
+          <w:numId w:val="10"/>
+        </w:numPr>
+        <w:spacing w:lineRule="auto"/>
+      </w:pPr>
+      <w:r>
+        <w:rPr/>
+        <w:t xml:space="preserve">Déterminer si un réapprovisionnement est nécessaire.</w:t>
+      </w:r>
+    </w:p>
+    <w:p>
+      <w:pPr>
+        <w:numPr>
+          <w:ilvl w:val="0"/>
+          <w:numId w:val="10"/>
+        </w:numPr>
+        <w:spacing w:lineRule="auto"/>
+      </w:pPr>
+      <w:r>
+        <w:rPr/>
+        <w:t xml:space="preserve">Formuler une </w:t>
+      </w:r>
+      <w:r>
+        <w:rPr>
+          <w:b/>
+        </w:rPr>
+        <w:t xml:space="preserve">décision tactique</w:t>
+      </w:r>
+      <w:r>
+        <w:rPr/>
+        <w:t xml:space="preserve">.</w:t>
+      </w:r>
+    </w:p>
+    <w:p>
+      <w:pPr>
+        <w:numPr>
+          <w:ilvl w:val="0"/>
+          <w:numId w:val="10"/>
+        </w:numPr>
+        <w:spacing w:lineRule="auto"/>
+      </w:pPr>
+      <w:r>
+        <w:rPr/>
+        <w:t xml:space="preserve">Indiquer un suivi si pertinent.</w:t>
+      </w:r>
+    </w:p>
+    <w:p>
+      <w:pPr>
+        <w:spacing w:lineRule="auto"/>
+      </w:pPr>
       <w:r>
         <w:rPr>
           <w:b/>
@@ -2473,7 +2722,7 @@
       </w:r>
       <w:r>
         <w:rPr/>
-        <w:t xml:space="preserve"> si le stock est ≥ minimum.</w:t>
+        <w:t xml:space="preserve"> est un résultat valide lorsque le stock est suffisant. N’inventez pas un besoin de réapprovisionnement.</w:t>
       </w:r>
     </w:p>
     <w:p>
@@ -2483,16 +2732,16 @@
       </w:pPr>
       <w:r>
         <w:rPr/>
-        <w:t xml:space="preserve">Ce que vous devez décider</w:t>
-      </w:r>
-    </w:p>
-    <w:p>
-      <w:pPr>
-        <w:spacing w:lineRule="auto"/>
-      </w:pPr>
-      <w:r>
-        <w:rPr/>
-        <w:t xml:space="preserve">Confirmer conformité ; indiquer si réappro est requis ; maintenir / surveiller.</w:t>
+        <w:t xml:space="preserve">Structure de raisonnement</w:t>
+      </w:r>
+    </w:p>
+    <w:p>
+      <w:pPr>
+        <w:spacing w:lineRule="auto"/>
+      </w:pPr>
+      <w:r>
+        <w:rPr/>
+        <w:t xml:space="preserve">Opérations → stock vs minimum → réappro (ou Q = 0) → décision tactique → suivi</w:t>
       </w:r>
     </w:p>
     <w:p>
@@ -2502,31 +2751,35 @@
       </w:pPr>
       <w:r>
         <w:rPr/>
-        <w:t xml:space="preserve">Ce que votre réponse doit démontrer</w:t>
-      </w:r>
-    </w:p>
-    <w:p>
-      <w:pPr>
-        <w:spacing w:lineRule="auto"/>
-      </w:pPr>
-      <w:r>
-        <w:rPr/>
-        <w:t xml:space="preserve">Conformité nominale · décision de réappro (souvent Q = 0) · suivi léger  </w:t>
-      </w:r>
-    </w:p>
-    <w:p>
-      <w:pPr>
-        <w:spacing w:lineRule="auto"/>
-      </w:pPr>
+        <w:t xml:space="preserve">Exemple de raisonnement</w:t>
+      </w:r>
+    </w:p>
+    <w:p>
+      <w:pPr>
+        <w:spacing w:lineRule="auto"/>
+      </w:pPr>
+      <w:r>
+        <w:rPr/>
+        <w:t xml:space="preserve">« Les opérations sont complétées et aucune variance n’est ouverte. Le stock reste supérieur au minimum, donc aucun réapprovisionnement n’est nécessaire et Q = 0. Je recommande de maintenir le processus et de suivre le prochain cycle. »</w:t>
+      </w:r>
+    </w:p>
+    <w:p>
+      <w:pPr>
+        <w:spacing w:lineRule="auto"/>
+      </w:pPr>
+      <w:r>
+        <w:rPr/>
+        <w:t xml:space="preserve">Ce texte illustre le raisonnement. </w:t>
+      </w:r>
       <w:r>
         <w:rPr>
           <w:b/>
         </w:rPr>
-        <w:t xml:space="preserve">N’inventez pas</w:t>
-      </w:r>
-      <w:r>
-        <w:rPr/>
-        <w:t xml:space="preserve"> formation, audit ou problème fictif.</w:t>
+        <w:t xml:space="preserve">Rédigez avec vos propres mots.</w:t>
+      </w:r>
+      <w:r>
+        <w:rPr/>
+        <w:t xml:space="preserve"> Ce n’est pas une réponse obligatoire.</w:t>
       </w:r>
     </w:p>
     <w:p>
@@ -2543,25 +2796,38 @@
       <w:pPr>
         <w:numPr>
           <w:ilvl w:val="0"/>
-          <w:numId w:val="9"/>
+          <w:numId w:val="11"/>
         </w:numPr>
         <w:spacing w:lineRule="auto"/>
       </w:pPr>
       <w:r>
         <w:rPr/>
-        <w:t xml:space="preserve">Forcer une action corrective sans écart  </w:t>
+        <w:t xml:space="preserve">Forcer une action corrective sans écart</w:t>
       </w:r>
     </w:p>
     <w:p>
       <w:pPr>
         <w:numPr>
           <w:ilvl w:val="0"/>
-          <w:numId w:val="9"/>
+          <w:numId w:val="11"/>
         </w:numPr>
         <w:spacing w:lineRule="auto"/>
       </w:pPr>
       <w:r>
         <w:rPr/>
+        <w:t xml:space="preserve">Inventer un réapprovisionnement alors que Q = 0</w:t>
+      </w:r>
+    </w:p>
+    <w:p>
+      <w:pPr>
+        <w:numPr>
+          <w:ilvl w:val="0"/>
+          <w:numId w:val="11"/>
+        </w:numPr>
+        <w:spacing w:lineRule="auto"/>
+      </w:pPr>
+      <w:r>
+        <w:rPr/>
         <w:t xml:space="preserve">Recopier les KPI du Module 4</w:t>
       </w:r>
     </w:p>
@@ -2572,7 +2838,7 @@
       </w:pPr>
       <w:r>
         <w:rPr/>
-        <w:t xml:space="preserve">SCN-016 — Écart puis décision tactique</w:t>
+        <w:t xml:space="preserve">SCN-016 — Décision tactique après réconciliation</w:t>
       </w:r>
     </w:p>
     <w:p>
@@ -2592,8 +2858,14 @@
         <w:t xml:space="preserve">Réconcilier d’abord, décider ensuite.</w:t>
       </w:r>
       <w:r>
-        <w:rPr/>
-        <w:br w:type="textWrapping"/>
+        <w:rPr>
+          <w:b/>
+        </w:rPr>
+        <w:t xml:space="preserve">Niveau :</w:t>
+      </w:r>
+      <w:r>
+        <w:rPr/>
+        <w:t xml:space="preserve"> Décision tactique après réconciliation </w:t>
       </w:r>
       <w:r>
         <w:rPr>
@@ -2603,7 +2875,7 @@
       </w:r>
       <w:r>
         <w:rPr/>
-        <w:t xml:space="preserve"> 2–4 phrases</w:t>
+        <w:t xml:space="preserve"> 2 à 3 phrases suffisent si la décision est basée sur le stock réconcilié.</w:t>
       </w:r>
     </w:p>
     <w:p>
@@ -2613,16 +2885,363 @@
       </w:pPr>
       <w:r>
         <w:rPr/>
-        <w:t xml:space="preserve">Ce que vous observez</w:t>
-      </w:r>
-    </w:p>
-    <w:p>
-      <w:pPr>
-        <w:spacing w:lineRule="auto"/>
-      </w:pPr>
-      <w:r>
-        <w:rPr/>
-        <w:t xml:space="preserve">Écart au comptage ; ajustement ; stock corrigé.</w:t>
+        <w:t xml:space="preserve">Contrat de production (valeurs exactes)</w:t>
+      </w:r>
+    </w:p>
+    <w:tbl>
+      <w:tblPr>
+        <w:tblBorders>
+          <w:top w:val="single" w:sz="2" w:space="0" w:color="000000"/>
+          <w:bottom w:val="single" w:sz="2" w:space="0" w:color="000000"/>
+          <w:left w:val="single" w:sz="2" w:space="0" w:color="000000"/>
+          <w:right w:val="single" w:sz="2" w:space="0" w:color="000000"/>
+        </w:tblBorders>
+        <w:tblCellSpacing w:w="0" w:type="dxa"/>
+        <w:tblCellMar>
+          <w:top w:type="dxa" w:w="80"/>
+          <w:bottom w:type="dxa" w:w="80"/>
+          <w:left w:type="dxa" w:w="160"/>
+          <w:right w:type="dxa" w:w="160"/>
+        </w:tblCellMar>
+        <w:jc w:val="center"/>
+      </w:tblPr>
+      <w:tblGrid>
+        <w:gridCol w:w="4680"/>
+        <w:gridCol w:w="4680"/>
+      </w:tblGrid>
+      <w:tr>
+        <w:trPr>
+          <w:cantSplit/>
+        </w:trPr>
+        <w:tc>
+          <w:tcPr>
+            <w:tcBorders>
+              <w:top w:val="single" w:sz="1" w:space="0" w:color="000000"/>
+              <w:bottom w:val="single" w:sz="1" w:space="0" w:color="000000"/>
+              <w:left w:val="single" w:sz="1" w:space="0" w:color="000000"/>
+              <w:right w:val="single" w:sz="1" w:space="0" w:color="000000"/>
+            </w:tcBorders>
+          </w:tcPr>
+          <w:p>
+            <w:pPr>
+              <w:spacing w:lineRule="auto"/>
+            </w:pPr>
+            <w:r>
+              <w:rPr/>
+              <w:t xml:space="preserve">Donnée</w:t>
+            </w:r>
+          </w:p>
+        </w:tc>
+        <w:tc>
+          <w:tcPr>
+            <w:tcBorders>
+              <w:top w:val="single" w:sz="1" w:space="0" w:color="000000"/>
+              <w:bottom w:val="single" w:sz="1" w:space="0" w:color="000000"/>
+              <w:left w:val="single" w:sz="1" w:space="0" w:color="000000"/>
+              <w:right w:val="single" w:sz="1" w:space="0" w:color="000000"/>
+            </w:tcBorders>
+          </w:tcPr>
+          <w:p>
+            <w:pPr>
+              <w:spacing w:lineRule="auto"/>
+            </w:pPr>
+            <w:r>
+              <w:rPr/>
+              <w:t xml:space="preserve">Valeur</w:t>
+            </w:r>
+          </w:p>
+        </w:tc>
+      </w:tr>
+      <w:tblGrid>
+        <w:gridCol w:w="4680"/>
+        <w:gridCol w:w="4680"/>
+      </w:tblGrid>
+      <w:tr>
+        <w:trPr>
+          <w:cantSplit/>
+        </w:trPr>
+        <w:tc>
+          <w:tcPr>
+            <w:tcBorders>
+              <w:top w:val="single" w:sz="1" w:space="0" w:color="000000"/>
+              <w:bottom w:val="single" w:sz="1" w:space="0" w:color="000000"/>
+              <w:left w:val="single" w:sz="1" w:space="0" w:color="000000"/>
+              <w:right w:val="single" w:sz="1" w:space="0" w:color="000000"/>
+            </w:tcBorders>
+          </w:tcPr>
+          <w:p>
+            <w:pPr>
+              <w:spacing w:lineRule="auto"/>
+            </w:pPr>
+            <w:r>
+              <w:rPr/>
+              <w:t xml:space="preserve">Stock système</w:t>
+            </w:r>
+          </w:p>
+        </w:tc>
+        <w:tc>
+          <w:tcPr>
+            <w:tcBorders>
+              <w:top w:val="single" w:sz="1" w:space="0" w:color="000000"/>
+              <w:bottom w:val="single" w:sz="1" w:space="0" w:color="000000"/>
+              <w:left w:val="single" w:sz="1" w:space="0" w:color="000000"/>
+              <w:right w:val="single" w:sz="1" w:space="0" w:color="000000"/>
+            </w:tcBorders>
+          </w:tcPr>
+          <w:p>
+            <w:pPr>
+              <w:spacing w:lineRule="auto"/>
+            </w:pPr>
+            <w:r>
+              <w:rPr>
+                <w:b/>
+              </w:rPr>
+              <w:t xml:space="preserve">50 u.</w:t>
+            </w:r>
+          </w:p>
+        </w:tc>
+      </w:tr>
+      <w:tr>
+        <w:trPr>
+          <w:cantSplit/>
+        </w:trPr>
+        <w:tc>
+          <w:tcPr>
+            <w:tcBorders>
+              <w:top w:val="single" w:sz="1" w:space="0" w:color="000000"/>
+              <w:bottom w:val="single" w:sz="1" w:space="0" w:color="000000"/>
+              <w:left w:val="single" w:sz="1" w:space="0" w:color="000000"/>
+              <w:right w:val="single" w:sz="1" w:space="0" w:color="000000"/>
+            </w:tcBorders>
+          </w:tcPr>
+          <w:p>
+            <w:pPr>
+              <w:spacing w:lineRule="auto"/>
+            </w:pPr>
+            <w:r>
+              <w:rPr/>
+              <w:t xml:space="preserve">Stock physique</w:t>
+            </w:r>
+          </w:p>
+        </w:tc>
+        <w:tc>
+          <w:tcPr>
+            <w:tcBorders>
+              <w:top w:val="single" w:sz="1" w:space="0" w:color="000000"/>
+              <w:bottom w:val="single" w:sz="1" w:space="0" w:color="000000"/>
+              <w:left w:val="single" w:sz="1" w:space="0" w:color="000000"/>
+              <w:right w:val="single" w:sz="1" w:space="0" w:color="000000"/>
+            </w:tcBorders>
+          </w:tcPr>
+          <w:p>
+            <w:pPr>
+              <w:spacing w:lineRule="auto"/>
+            </w:pPr>
+            <w:r>
+              <w:rPr>
+                <w:b/>
+              </w:rPr>
+              <w:t xml:space="preserve">45 u.</w:t>
+            </w:r>
+          </w:p>
+        </w:tc>
+      </w:tr>
+      <w:tr>
+        <w:trPr>
+          <w:cantSplit/>
+        </w:trPr>
+        <w:tc>
+          <w:tcPr>
+            <w:tcBorders>
+              <w:top w:val="single" w:sz="1" w:space="0" w:color="000000"/>
+              <w:bottom w:val="single" w:sz="1" w:space="0" w:color="000000"/>
+              <w:left w:val="single" w:sz="1" w:space="0" w:color="000000"/>
+              <w:right w:val="single" w:sz="1" w:space="0" w:color="000000"/>
+            </w:tcBorders>
+          </w:tcPr>
+          <w:p>
+            <w:pPr>
+              <w:spacing w:lineRule="auto"/>
+            </w:pPr>
+            <w:r>
+              <w:rPr/>
+              <w:t xml:space="preserve">Écart</w:t>
+            </w:r>
+          </w:p>
+        </w:tc>
+        <w:tc>
+          <w:tcPr>
+            <w:tcBorders>
+              <w:top w:val="single" w:sz="1" w:space="0" w:color="000000"/>
+              <w:bottom w:val="single" w:sz="1" w:space="0" w:color="000000"/>
+              <w:left w:val="single" w:sz="1" w:space="0" w:color="000000"/>
+              <w:right w:val="single" w:sz="1" w:space="0" w:color="000000"/>
+            </w:tcBorders>
+          </w:tcPr>
+          <w:p>
+            <w:pPr>
+              <w:spacing w:lineRule="auto"/>
+            </w:pPr>
+            <w:r>
+              <w:rPr>
+                <w:b/>
+              </w:rPr>
+              <w:t xml:space="preserve">−5</w:t>
+            </w:r>
+          </w:p>
+        </w:tc>
+      </w:tr>
+      <w:tr>
+        <w:trPr>
+          <w:cantSplit/>
+        </w:trPr>
+        <w:tc>
+          <w:tcPr>
+            <w:tcBorders>
+              <w:top w:val="single" w:sz="1" w:space="0" w:color="000000"/>
+              <w:bottom w:val="single" w:sz="1" w:space="0" w:color="000000"/>
+              <w:left w:val="single" w:sz="1" w:space="0" w:color="000000"/>
+              <w:right w:val="single" w:sz="1" w:space="0" w:color="000000"/>
+            </w:tcBorders>
+          </w:tcPr>
+          <w:p>
+            <w:pPr>
+              <w:spacing w:lineRule="auto"/>
+            </w:pPr>
+            <w:r>
+              <w:rPr/>
+              <w:t xml:space="preserve">Stock corrigé (après ADJ)</w:t>
+            </w:r>
+          </w:p>
+        </w:tc>
+        <w:tc>
+          <w:tcPr>
+            <w:tcBorders>
+              <w:top w:val="single" w:sz="1" w:space="0" w:color="000000"/>
+              <w:bottom w:val="single" w:sz="1" w:space="0" w:color="000000"/>
+              <w:left w:val="single" w:sz="1" w:space="0" w:color="000000"/>
+              <w:right w:val="single" w:sz="1" w:space="0" w:color="000000"/>
+            </w:tcBorders>
+          </w:tcPr>
+          <w:p>
+            <w:pPr>
+              <w:spacing w:lineRule="auto"/>
+            </w:pPr>
+            <w:r>
+              <w:rPr>
+                <w:b/>
+              </w:rPr>
+              <w:t xml:space="preserve">45 u.</w:t>
+            </w:r>
+          </w:p>
+        </w:tc>
+      </w:tr>
+      <w:tr>
+        <w:trPr>
+          <w:cantSplit/>
+        </w:trPr>
+        <w:tc>
+          <w:tcPr>
+            <w:tcBorders>
+              <w:top w:val="single" w:sz="1" w:space="0" w:color="000000"/>
+              <w:bottom w:val="single" w:sz="1" w:space="0" w:color="000000"/>
+              <w:left w:val="single" w:sz="1" w:space="0" w:color="000000"/>
+              <w:right w:val="single" w:sz="1" w:space="0" w:color="000000"/>
+            </w:tcBorders>
+          </w:tcPr>
+          <w:p>
+            <w:pPr>
+              <w:spacing w:lineRule="auto"/>
+            </w:pPr>
+            <w:r>
+              <w:rPr/>
+              <w:t xml:space="preserve">Min / Max / SS</w:t>
+            </w:r>
+          </w:p>
+        </w:tc>
+        <w:tc>
+          <w:tcPr>
+            <w:tcBorders>
+              <w:top w:val="single" w:sz="1" w:space="0" w:color="000000"/>
+              <w:bottom w:val="single" w:sz="1" w:space="0" w:color="000000"/>
+              <w:left w:val="single" w:sz="1" w:space="0" w:color="000000"/>
+              <w:right w:val="single" w:sz="1" w:space="0" w:color="000000"/>
+            </w:tcBorders>
+          </w:tcPr>
+          <w:p>
+            <w:pPr>
+              <w:spacing w:lineRule="auto"/>
+            </w:pPr>
+            <w:r>
+              <w:rPr>
+                <w:b/>
+              </w:rPr>
+              <w:t xml:space="preserve">10 / 100 / 5</w:t>
+            </w:r>
+          </w:p>
+        </w:tc>
+      </w:tr>
+      <w:tr>
+        <w:trPr>
+          <w:cantSplit/>
+        </w:trPr>
+        <w:tc>
+          <w:tcPr>
+            <w:tcBorders>
+              <w:top w:val="single" w:sz="1" w:space="0" w:color="000000"/>
+              <w:bottom w:val="single" w:sz="1" w:space="0" w:color="000000"/>
+              <w:left w:val="single" w:sz="1" w:space="0" w:color="000000"/>
+              <w:right w:val="single" w:sz="1" w:space="0" w:color="000000"/>
+            </w:tcBorders>
+          </w:tcPr>
+          <w:p>
+            <w:pPr>
+              <w:spacing w:lineRule="auto"/>
+            </w:pPr>
+            <w:r>
+              <w:rPr/>
+              <w:t xml:space="preserve">Q de réapprovisionnement</w:t>
+            </w:r>
+          </w:p>
+        </w:tc>
+        <w:tc>
+          <w:tcPr>
+            <w:tcBorders>
+              <w:top w:val="single" w:sz="1" w:space="0" w:color="000000"/>
+              <w:bottom w:val="single" w:sz="1" w:space="0" w:color="000000"/>
+              <w:left w:val="single" w:sz="1" w:space="0" w:color="000000"/>
+              <w:right w:val="single" w:sz="1" w:space="0" w:color="000000"/>
+            </w:tcBorders>
+          </w:tcPr>
+          <w:p>
+            <w:pPr>
+              <w:spacing w:lineRule="auto"/>
+            </w:pPr>
+            <w:r>
+              <w:rPr>
+                <w:b/>
+              </w:rPr>
+              <w:t xml:space="preserve">0</w:t>
+            </w:r>
+          </w:p>
+          <w:p>
+            <w:pPr>
+              <w:spacing w:lineRule="auto"/>
+            </w:pPr>
+            <w:r>
+              <w:rPr/>
+              <w:t xml:space="preserve"> (stock corrigé ≥ Min)</w:t>
+            </w:r>
+          </w:p>
+        </w:tc>
+      </w:tr>
+    </w:tbl>
+    <w:p>
+      <w:pPr>
+        <w:spacing w:lineRule="auto"/>
+      </w:pPr>
+      <w:r>
+        <w:rPr/>
       </w:r>
     </w:p>
     <w:p>
@@ -2632,119 +3251,401 @@
       </w:pPr>
       <w:r>
         <w:rPr/>
-        <w:t xml:space="preserve">Ce que vous devez comprendre</w:t>
-      </w:r>
-    </w:p>
-    <w:p>
-      <w:pPr>
-        <w:spacing w:lineRule="auto"/>
-      </w:pPr>
-      <w:r>
-        <w:rPr/>
-        <w:t xml:space="preserve">Réappro et KPI se basent sur le stock </w:t>
-      </w:r>
+        <w:t xml:space="preserve">Deux états de l’interface</w:t>
+      </w:r>
+    </w:p>
+    <w:p>
+      <w:pPr>
+        <w:spacing w:lineRule="auto"/>
+      </w:pPr>
       <w:r>
         <w:rPr>
           <w:b/>
         </w:rPr>
-        <w:t xml:space="preserve">après</w:t>
-      </w:r>
-      <w:r>
-        <w:rPr/>
-        <w:t xml:space="preserve"> correction.</w:t>
-      </w:r>
-    </w:p>
-    <w:p>
-      <w:pPr>
-        <w:pStyle w:val="Heading3"/>
-        <w:spacing w:lineRule="auto"/>
-      </w:pPr>
-      <w:r>
-        <w:rPr/>
-        <w:t xml:space="preserve">Ce que vous devez décider</w:t>
-      </w:r>
-    </w:p>
-    <w:p>
-      <w:pPr>
-        <w:spacing w:lineRule="auto"/>
-      </w:pPr>
-      <w:r>
-        <w:rPr/>
-        <w:t xml:space="preserve">Sur stock corrigé : réappro ou Q = 0 ; suivi éventuel.</w:t>
-      </w:r>
-    </w:p>
-    <w:p>
-      <w:pPr>
-        <w:pStyle w:val="Heading3"/>
-        <w:spacing w:lineRule="auto"/>
-      </w:pPr>
-      <w:r>
-        <w:rPr/>
-        <w:t xml:space="preserve">Ce que votre réponse doit démontrer</w:t>
-      </w:r>
-    </w:p>
-    <w:p>
-      <w:pPr>
-        <w:spacing w:lineRule="auto"/>
-      </w:pPr>
-      <w:r>
-        <w:rPr/>
-        <w:t xml:space="preserve">Reconnaissance de l’écart / correction · décision sur stock réconcilié  </w:t>
-      </w:r>
-    </w:p>
-    <w:p>
-      <w:pPr>
-        <w:spacing w:lineRule="auto"/>
-      </w:pPr>
-      <w:r>
-        <w:rPr/>
-        <w:t xml:space="preserve">La prévention est utile mais </w:t>
+        <w:t xml:space="preserve">Avant réconciliation</w:t>
+      </w:r>
+    </w:p>
+    <w:p>
+      <w:pPr>
+        <w:numPr>
+          <w:ilvl w:val="0"/>
+          <w:numId w:val="12"/>
+        </w:numPr>
+        <w:spacing w:lineRule="auto"/>
+      </w:pPr>
+      <w:r>
+        <w:rPr/>
+        <w:t xml:space="preserve">Stock système </w:t>
       </w:r>
       <w:r>
         <w:rPr>
           <w:b/>
         </w:rPr>
-        <w:t xml:space="preserve">pas obligatoire</w:t>
-      </w:r>
-      <w:r>
-        <w:rPr/>
-        <w:t xml:space="preserve"> sauf si la question le demande.</w:t>
-      </w:r>
-    </w:p>
-    <w:p>
-      <w:pPr>
-        <w:pStyle w:val="Heading3"/>
-        <w:spacing w:lineRule="auto"/>
-      </w:pPr>
-      <w:r>
-        <w:rPr/>
-        <w:t xml:space="preserve">Erreurs de raisonnement à éviter</w:t>
+        <w:t xml:space="preserve">50</w:t>
+      </w:r>
+      <w:r>
+        <w:rPr/>
+        <w:t xml:space="preserve"> · stock physique </w:t>
+      </w:r>
+      <w:r>
+        <w:rPr>
+          <w:b/>
+        </w:rPr>
+        <w:t xml:space="preserve">45</w:t>
+      </w:r>
+      <w:r>
+        <w:rPr/>
+        <w:t xml:space="preserve"> · écart </w:t>
+      </w:r>
+      <w:r>
+        <w:rPr>
+          <w:b/>
+        </w:rPr>
+        <w:t xml:space="preserve">−5</w:t>
       </w:r>
     </w:p>
     <w:p>
       <w:pPr>
         <w:numPr>
           <w:ilvl w:val="0"/>
-          <w:numId w:val="10"/>
+          <w:numId w:val="12"/>
         </w:numPr>
         <w:spacing w:lineRule="auto"/>
       </w:pPr>
       <w:r>
         <w:rPr/>
-        <w:t xml:space="preserve">Décider avant l’ajustement  </w:t>
+        <w:t xml:space="preserve">Réconciliation en attente · ajustement requis</w:t>
       </w:r>
     </w:p>
     <w:p>
       <w:pPr>
         <w:numPr>
           <w:ilvl w:val="0"/>
-          <w:numId w:val="10"/>
+          <w:numId w:val="12"/>
         </w:numPr>
         <w:spacing w:lineRule="auto"/>
       </w:pPr>
       <w:r>
         <w:rPr/>
-        <w:t xml:space="preserve">Ignorer l’écart ouvert</w:t>
+        <w:t xml:space="preserve">Pas encore de base de décision sur stock corrigé</w:t>
+      </w:r>
+    </w:p>
+    <w:p>
+      <w:pPr>
+        <w:spacing w:lineRule="auto"/>
+      </w:pPr>
+      <w:r>
+        <w:rPr>
+          <w:b/>
+        </w:rPr>
+        <w:t xml:space="preserve">Après réconciliation</w:t>
+      </w:r>
+    </w:p>
+    <w:p>
+      <w:pPr>
+        <w:numPr>
+          <w:ilvl w:val="0"/>
+          <w:numId w:val="13"/>
+        </w:numPr>
+        <w:spacing w:lineRule="auto"/>
+      </w:pPr>
+      <w:r>
+        <w:rPr/>
+        <w:t xml:space="preserve">Stock corrigé </w:t>
+      </w:r>
+      <w:r>
+        <w:rPr>
+          <w:b/>
+        </w:rPr>
+        <w:t xml:space="preserve">45</w:t>
+      </w:r>
+      <w:r>
+        <w:rPr/>
+        <w:t xml:space="preserve"> · ADJ </w:t>
+      </w:r>
+      <w:r>
+        <w:rPr>
+          <w:b/>
+        </w:rPr>
+        <w:t xml:space="preserve">−5</w:t>
+      </w:r>
+      <w:r>
+        <w:rPr/>
+        <w:t xml:space="preserve"> posté</w:t>
+      </w:r>
+    </w:p>
+    <w:p>
+      <w:pPr>
+        <w:numPr>
+          <w:ilvl w:val="0"/>
+          <w:numId w:val="13"/>
+        </w:numPr>
+        <w:spacing w:lineRule="auto"/>
+      </w:pPr>
+      <w:r>
+        <w:rPr/>
+        <w:t xml:space="preserve">Base de décision de réapprovisionnement (Min 10 → </w:t>
+      </w:r>
+      <w:r>
+        <w:rPr>
+          <w:b/>
+        </w:rPr>
+        <w:t xml:space="preserve">Q = 0</w:t>
+      </w:r>
+      <w:r>
+        <w:rPr/>
+        <w:t xml:space="preserve">)</w:t>
+      </w:r>
+    </w:p>
+    <w:p>
+      <w:pPr>
+        <w:numPr>
+          <w:ilvl w:val="0"/>
+          <w:numId w:val="13"/>
+        </w:numPr>
+        <w:spacing w:lineRule="auto"/>
+      </w:pPr>
+      <w:r>
+        <w:rPr/>
+        <w:t xml:space="preserve">Décision finale fondée sur l’inventaire corrigé</w:t>
+      </w:r>
+    </w:p>
+    <w:p>
+      <w:pPr>
+        <w:spacing w:lineRule="auto"/>
+      </w:pPr>
+      <w:r>
+        <w:rPr/>
+        <w:t xml:space="preserve">Tant qu’un ajustement requis n’est pas résolu, la décision reste </w:t>
+      </w:r>
+      <w:r>
+        <w:rPr>
+          <w:b/>
+        </w:rPr>
+        <w:t xml:space="preserve">bloquée</w:t>
+      </w:r>
+      <w:r>
+        <w:rPr/>
+        <w:t xml:space="preserve">. Ne basez pas votre décision sur le stock avant correction.</w:t>
+      </w:r>
+    </w:p>
+    <w:p>
+      <w:pPr>
+        <w:spacing w:lineRule="auto"/>
+      </w:pPr>
+      <w:r>
+        <w:rPr/>
+        <w:t xml:space="preserve">Si l’écart est nul, l’interface peut indiquer </w:t>
+      </w:r>
+      <w:r>
+        <w:rPr>
+          <w:b/>
+        </w:rPr>
+        <w:t xml:space="preserve">ADJ non requis</w:t>
+      </w:r>
+      <w:r>
+        <w:rPr/>
+        <w:t xml:space="preserve"> : cela ne signifie pas qu’un ajustement a eu lieu.</w:t>
+      </w:r>
+    </w:p>
+    <w:p>
+      <w:pPr>
+        <w:pStyle w:val="Heading3"/>
+        <w:spacing w:lineRule="auto"/>
+      </w:pPr>
+      <w:r>
+        <w:rPr/>
+        <w:t xml:space="preserve">Structure de raisonnement</w:t>
+      </w:r>
+    </w:p>
+    <w:p>
+      <w:pPr>
+        <w:numPr>
+          <w:ilvl w:val="0"/>
+          <w:numId w:val="14"/>
+        </w:numPr>
+        <w:spacing w:lineRule="auto"/>
+      </w:pPr>
+      <w:r>
+        <w:rPr/>
+        <w:t xml:space="preserve">Identifier la variance (−5)</w:t>
+      </w:r>
+    </w:p>
+    <w:p>
+      <w:pPr>
+        <w:numPr>
+          <w:ilvl w:val="0"/>
+          <w:numId w:val="14"/>
+        </w:numPr>
+        <w:spacing w:lineRule="auto"/>
+      </w:pPr>
+      <w:r>
+        <w:rPr/>
+        <w:t xml:space="preserve">Confirmer la réconciliation / ADJ</w:t>
+      </w:r>
+    </w:p>
+    <w:p>
+      <w:pPr>
+        <w:numPr>
+          <w:ilvl w:val="0"/>
+          <w:numId w:val="14"/>
+        </w:numPr>
+        <w:spacing w:lineRule="auto"/>
+      </w:pPr>
+      <w:r>
+        <w:rPr/>
+        <w:t xml:space="preserve">Utiliser le </w:t>
+      </w:r>
+      <w:r>
+        <w:rPr>
+          <w:b/>
+        </w:rPr>
+        <w:t xml:space="preserve">stock corrigé (45)</w:t>
+      </w:r>
+    </w:p>
+    <w:p>
+      <w:pPr>
+        <w:numPr>
+          <w:ilvl w:val="0"/>
+          <w:numId w:val="14"/>
+        </w:numPr>
+        <w:spacing w:lineRule="auto"/>
+      </w:pPr>
+      <w:r>
+        <w:rPr/>
+        <w:t xml:space="preserve">Comparer au minimum (10)</w:t>
+      </w:r>
+    </w:p>
+    <w:p>
+      <w:pPr>
+        <w:numPr>
+          <w:ilvl w:val="0"/>
+          <w:numId w:val="14"/>
+        </w:numPr>
+        <w:spacing w:lineRule="auto"/>
+      </w:pPr>
+      <w:r>
+        <w:rPr/>
+        <w:t xml:space="preserve">Déterminer le réapprovisionnement (</w:t>
+      </w:r>
+      <w:r>
+        <w:rPr>
+          <w:b/>
+        </w:rPr>
+        <w:t xml:space="preserve">Q = 0</w:t>
+      </w:r>
+      <w:r>
+        <w:rPr/>
+        <w:t xml:space="preserve">)</w:t>
+      </w:r>
+    </w:p>
+    <w:p>
+      <w:pPr>
+        <w:numPr>
+          <w:ilvl w:val="0"/>
+          <w:numId w:val="14"/>
+        </w:numPr>
+        <w:spacing w:lineRule="auto"/>
+      </w:pPr>
+      <w:r>
+        <w:rPr/>
+        <w:t xml:space="preserve">Recommander l’action tactique</w:t>
+      </w:r>
+    </w:p>
+    <w:p>
+      <w:pPr>
+        <w:pStyle w:val="Heading3"/>
+        <w:spacing w:lineRule="auto"/>
+      </w:pPr>
+      <w:r>
+        <w:rPr/>
+        <w:t xml:space="preserve">Exemple de raisonnement</w:t>
+      </w:r>
+    </w:p>
+    <w:p>
+      <w:pPr>
+        <w:spacing w:lineRule="auto"/>
+      </w:pPr>
+      <w:r>
+        <w:rPr/>
+        <w:t xml:space="preserve">« L’écart a été réconcilié et le stock corrigé (45) constitue maintenant la base de décision. Le niveau corrigé reste suffisant par rapport au minimum ; aucun réapprovisionnement n’est requis. Je recommande de poursuivre le suivi des comptages. »</w:t>
+      </w:r>
+    </w:p>
+    <w:p>
+      <w:pPr>
+        <w:spacing w:lineRule="auto"/>
+      </w:pPr>
+      <w:r>
+        <w:rPr>
+          <w:b/>
+        </w:rPr>
+        <w:t xml:space="preserve">Avec vos propres mots.</w:t>
+      </w:r>
+      <w:r>
+        <w:rPr/>
+        <w:t xml:space="preserve"> Ce n’est pas une phrase exacte requise.</w:t>
+      </w:r>
+    </w:p>
+    <w:p>
+      <w:pPr>
+        <w:pStyle w:val="Heading3"/>
+        <w:spacing w:lineRule="auto"/>
+      </w:pPr>
+      <w:r>
+        <w:rPr/>
+        <w:t xml:space="preserve">Erreurs de raisonnement à éviter</w:t>
+      </w:r>
+    </w:p>
+    <w:p>
+      <w:pPr>
+        <w:numPr>
+          <w:ilvl w:val="0"/>
+          <w:numId w:val="15"/>
+        </w:numPr>
+        <w:spacing w:lineRule="auto"/>
+      </w:pPr>
+      <w:r>
+        <w:rPr/>
+        <w:t xml:space="preserve">Décider avant la réconciliation / l’ajustement</w:t>
+      </w:r>
+    </w:p>
+    <w:p>
+      <w:pPr>
+        <w:numPr>
+          <w:ilvl w:val="0"/>
+          <w:numId w:val="15"/>
+        </w:numPr>
+        <w:spacing w:lineRule="auto"/>
+      </w:pPr>
+      <w:r>
+        <w:rPr/>
+        <w:t xml:space="preserve">Ignorer un écart ouvert</w:t>
+      </w:r>
+    </w:p>
+    <w:p>
+      <w:pPr>
+        <w:numPr>
+          <w:ilvl w:val="0"/>
+          <w:numId w:val="15"/>
+        </w:numPr>
+        <w:spacing w:lineRule="auto"/>
+      </w:pPr>
+      <w:r>
+        <w:rPr/>
+        <w:t xml:space="preserve">Calculer Q = Max − stock (55) sans tenir compte du seuil Min</w:t>
+      </w:r>
+    </w:p>
+    <w:p>
+      <w:pPr>
+        <w:numPr>
+          <w:ilvl w:val="0"/>
+          <w:numId w:val="15"/>
+        </w:numPr>
+        <w:spacing w:lineRule="auto"/>
+      </w:pPr>
+      <w:r>
+        <w:rPr/>
+        <w:t xml:space="preserve">Traiter « ADJ non requis » comme si un ajustement avait été posté</w:t>
       </w:r>
     </w:p>
     <w:p>
@@ -2754,13 +3655,23 @@
       </w:pPr>
       <w:r>
         <w:rPr/>
-        <w:t xml:space="preserve">SCN-017 — Décision stratégique (capstone)</w:t>
-      </w:r>
-    </w:p>
-    <w:p>
-      <w:pPr>
-        <w:spacing w:lineRule="auto"/>
-      </w:pPr>
+        <w:t xml:space="preserve">SCN-017 — Décision stratégique à partir des KPI de la session</w:t>
+      </w:r>
+    </w:p>
+    <w:p>
+      <w:pPr>
+        <w:spacing w:lineRule="auto"/>
+      </w:pPr>
+      <w:r>
+        <w:rPr>
+          <w:b/>
+        </w:rPr>
+        <w:t xml:space="preserve">Niveau :</w:t>
+      </w:r>
+      <w:r>
+        <w:rPr/>
+        <w:t xml:space="preserve"> Décision stratégique </w:t>
+      </w:r>
       <w:r>
         <w:rPr>
           <w:b/>
@@ -2769,11 +3680,7 @@
       </w:r>
       <w:r>
         <w:rPr/>
-        <w:t xml:space="preserve"> Preuves → Priorité → Compromis → Horizon</w:t>
-      </w:r>
-      <w:r>
-        <w:rPr/>
-        <w:br w:type="textWrapping"/>
+        <w:t xml:space="preserve"> Preuves → Priorité → Compromis → Horizon </w:t>
       </w:r>
       <w:r>
         <w:rPr>
@@ -2783,7 +3690,7 @@
       </w:r>
       <w:r>
         <w:rPr/>
-        <w:t xml:space="preserve"> 4–6 phrases</w:t>
+        <w:t xml:space="preserve"> 4 à 6 phrases suffisent si les quatre blocs du raisonnement sont présents.</w:t>
       </w:r>
     </w:p>
     <w:p>
@@ -2793,26 +3700,55 @@
       </w:pPr>
       <w:r>
         <w:rPr/>
-        <w:t xml:space="preserve">Ce que vous observez</w:t>
-      </w:r>
-    </w:p>
-    <w:p>
-      <w:pPr>
-        <w:spacing w:lineRule="auto"/>
-      </w:pPr>
-      <w:r>
-        <w:rPr/>
-        <w:t xml:space="preserve">Snapshot M5_KPI </w:t>
+        <w:t xml:space="preserve">Ce que le panneau peut afficher</w:t>
+      </w:r>
+    </w:p>
+    <w:p>
+      <w:pPr>
+        <w:spacing w:lineRule="auto"/>
+      </w:pPr>
+      <w:r>
+        <w:rPr/>
+        <w:t xml:space="preserve">Rotation · service · taux d’erreur · délai moyen · valeur du stock · autres KPI de session disponibles.</w:t>
+      </w:r>
+    </w:p>
+    <w:p>
+      <w:pPr>
+        <w:spacing w:lineRule="auto"/>
+      </w:pPr>
+      <w:r>
+        <w:rPr/>
+        <w:t xml:space="preserve">Les valeurs viennent du </w:t>
       </w:r>
       <w:r>
         <w:rPr>
           <w:b/>
         </w:rPr>
-        <w:t xml:space="preserve">de votre session</w:t>
-      </w:r>
-      <w:r>
-        <w:rPr/>
-        <w:t xml:space="preserve"> (pas l’Annexe M4).</w:t>
+        <w:t xml:space="preserve">run courant</w:t>
+      </w:r>
+      <w:r>
+        <w:rPr/>
+        <w:t xml:space="preserve">. Une valeur manquante peut apparaître comme </w:t>
+      </w:r>
+      <w:r>
+        <w:rPr>
+          <w:b/>
+        </w:rPr>
+        <w:t xml:space="preserve">—</w:t>
+      </w:r>
+      <w:r>
+        <w:rPr/>
+        <w:t xml:space="preserve">. Un zéro légitime reste affiché comme </w:t>
+      </w:r>
+      <w:r>
+        <w:rPr>
+          <w:b/>
+        </w:rPr>
+        <w:t xml:space="preserve">0</w:t>
+      </w:r>
+      <w:r>
+        <w:rPr/>
+        <w:t xml:space="preserve">. Aucune orientation stratégique n’est présélectionnée.</w:t>
       </w:r>
     </w:p>
     <w:p>
@@ -2822,97 +3758,121 @@
       </w:pPr>
       <w:r>
         <w:rPr/>
-        <w:t xml:space="preserve">Ce que vous devez comprendre</w:t>
-      </w:r>
-    </w:p>
-    <w:p>
-      <w:pPr>
-        <w:spacing w:lineRule="auto"/>
-      </w:pPr>
-      <w:r>
-        <w:rPr/>
-        <w:t xml:space="preserve">Niveau stratégique : arbitrage durable, pas une transaction ops.</w:t>
-      </w:r>
-    </w:p>
-    <w:p>
-      <w:pPr>
-        <w:pStyle w:val="Heading3"/>
-        <w:spacing w:lineRule="auto"/>
-      </w:pPr>
-      <w:r>
-        <w:rPr/>
-        <w:t xml:space="preserve">Ce que vous devez décider</w:t>
-      </w:r>
-    </w:p>
-    <w:p>
-      <w:pPr>
-        <w:spacing w:lineRule="auto"/>
-      </w:pPr>
-      <w:r>
-        <w:rPr/>
-        <w:t xml:space="preserve">Priorité stratégique + compromis + horizon 90–180 j (ou équivalent).</w:t>
-      </w:r>
-    </w:p>
-    <w:p>
-      <w:pPr>
-        <w:pStyle w:val="Heading3"/>
-        <w:spacing w:lineRule="auto"/>
-      </w:pPr>
-      <w:r>
-        <w:rPr/>
-        <w:t xml:space="preserve">Ce que votre réponse doit démontrer</w:t>
+        <w:t xml:space="preserve">Ce que vous devez démontrer</w:t>
       </w:r>
     </w:p>
     <w:p>
       <w:pPr>
         <w:numPr>
           <w:ilvl w:val="0"/>
-          <w:numId w:val="11"/>
+          <w:numId w:val="16"/>
         </w:numPr>
         <w:spacing w:lineRule="auto"/>
       </w:pPr>
       <w:r>
         <w:rPr/>
-        <w:t xml:space="preserve">≥ 2 KPI chiffrés du snapshot  </w:t>
+        <w:t xml:space="preserve">Citer </w:t>
+      </w:r>
+      <w:r>
+        <w:rPr>
+          <w:b/>
+        </w:rPr>
+        <w:t xml:space="preserve">au moins deux KPI</w:t>
+      </w:r>
+      <w:r>
+        <w:rPr/>
+        <w:t xml:space="preserve"> disponibles</w:t>
       </w:r>
     </w:p>
     <w:p>
       <w:pPr>
         <w:numPr>
           <w:ilvl w:val="0"/>
-          <w:numId w:val="11"/>
+          <w:numId w:val="16"/>
         </w:numPr>
         <w:spacing w:lineRule="auto"/>
       </w:pPr>
       <w:r>
         <w:rPr/>
-        <w:t xml:space="preserve">Une priorité  </w:t>
+        <w:t xml:space="preserve">Choisir une </w:t>
+      </w:r>
+      <w:r>
+        <w:rPr>
+          <w:b/>
+        </w:rPr>
+        <w:t xml:space="preserve">priorité stratégique</w:t>
       </w:r>
     </w:p>
     <w:p>
       <w:pPr>
         <w:numPr>
           <w:ilvl w:val="0"/>
-          <w:numId w:val="11"/>
+          <w:numId w:val="16"/>
         </w:numPr>
         <w:spacing w:lineRule="auto"/>
       </w:pPr>
       <w:r>
         <w:rPr/>
-        <w:t xml:space="preserve">Un compromis (même sans le mot « trade-off »)  </w:t>
+        <w:t xml:space="preserve">Expliquer le </w:t>
+      </w:r>
+      <w:r>
+        <w:rPr>
+          <w:b/>
+        </w:rPr>
+        <w:t xml:space="preserve">compromis</w:t>
       </w:r>
     </w:p>
     <w:p>
       <w:pPr>
         <w:numPr>
           <w:ilvl w:val="0"/>
-          <w:numId w:val="11"/>
+          <w:numId w:val="16"/>
         </w:numPr>
         <w:spacing w:lineRule="auto"/>
       </w:pPr>
       <w:r>
         <w:rPr/>
-        <w:t xml:space="preserve">Un horizon de revue</w:t>
+        <w:t xml:space="preserve">Indiquer l’</w:t>
+      </w:r>
+      <w:r>
+        <w:rPr>
+          <w:b/>
+        </w:rPr>
+        <w:t xml:space="preserve">horizon de suivi</w:t>
+      </w:r>
+    </w:p>
+    <w:p>
+      <w:pPr>
+        <w:pStyle w:val="Heading3"/>
+        <w:spacing w:lineRule="auto"/>
+      </w:pPr>
+      <w:r>
+        <w:rPr/>
+        <w:t xml:space="preserve">Exemple de raisonnement</w:t>
+      </w:r>
+    </w:p>
+    <w:p>
+      <w:pPr>
+        <w:spacing w:lineRule="auto"/>
+      </w:pPr>
+      <w:r>
+        <w:rPr/>
+        <w:t xml:space="preserve">« Le taux de service est élevé, mais le taux d’erreur reste à surveiller. Je recommande de prioriser la qualité d’exécution afin de réduire les erreurs sans dégrader le service. Cette orientation peut reporter une réduction immédiate du stock. Les résultats seront réévalués dans 90 jours. »</w:t>
+      </w:r>
+    </w:p>
+    <w:p>
+      <w:pPr>
+        <w:spacing w:lineRule="auto"/>
+      </w:pPr>
+      <w:r>
+        <w:rPr/>
+        <w:t xml:space="preserve">Idées de raisonnement — </w:t>
+      </w:r>
+      <w:r>
+        <w:rPr>
+          <w:b/>
+        </w:rPr>
+        <w:t xml:space="preserve">rédigez avec vos propres mots.</w:t>
       </w:r>
     </w:p>
     <w:p>
@@ -2929,39 +3889,52 @@
       <w:pPr>
         <w:numPr>
           <w:ilvl w:val="0"/>
-          <w:numId w:val="12"/>
+          <w:numId w:val="17"/>
         </w:numPr>
         <w:spacing w:lineRule="auto"/>
       </w:pPr>
       <w:r>
         <w:rPr/>
-        <w:t xml:space="preserve">Recopier 6× / 95 % / 48 000 $ du Module 4  </w:t>
+        <w:t xml:space="preserve">Recopier les valeurs du portefeuille Module 4</w:t>
       </w:r>
     </w:p>
     <w:p>
       <w:pPr>
         <w:numPr>
           <w:ilvl w:val="0"/>
-          <w:numId w:val="12"/>
+          <w:numId w:val="17"/>
         </w:numPr>
         <w:spacing w:lineRule="auto"/>
       </w:pPr>
       <w:r>
         <w:rPr/>
-        <w:t xml:space="preserve">Réponse purement opérationnelle (poster réception, putaway…)  </w:t>
+        <w:t xml:space="preserve">Réponse purement opérationnelle (poster une réception, un putaway…)</w:t>
       </w:r>
     </w:p>
     <w:p>
       <w:pPr>
         <w:numPr>
           <w:ilvl w:val="0"/>
-          <w:numId w:val="12"/>
+          <w:numId w:val="17"/>
         </w:numPr>
         <w:spacing w:lineRule="auto"/>
       </w:pPr>
       <w:r>
         <w:rPr/>
         <w:t xml:space="preserve">Pas de compromis / pas d’horizon</w:t>
+      </w:r>
+    </w:p>
+    <w:p>
+      <w:pPr>
+        <w:numPr>
+          <w:ilvl w:val="0"/>
+          <w:numId w:val="17"/>
+        </w:numPr>
+        <w:spacing w:lineRule="auto"/>
+      </w:pPr>
+      <w:r>
+        <w:rPr/>
+        <w:t xml:space="preserve">S’appuyer sur un seul KPI alors que d’autres sont disponibles</w:t>
       </w:r>
     </w:p>
     <w:p>
@@ -3370,26 +4343,26 @@
             </w:pPr>
             <w:r>
               <w:rPr/>
-              <w:t xml:space="preserve">Tactique</w:t>
-            </w:r>
-          </w:p>
-        </w:tc>
-        <w:tc>
-          <w:tcPr>
-            <w:tcBorders>
-              <w:top w:val="single" w:sz="1" w:space="0" w:color="000000"/>
-              <w:bottom w:val="single" w:sz="1" w:space="0" w:color="000000"/>
-              <w:left w:val="single" w:sz="1" w:space="0" w:color="000000"/>
-              <w:right w:val="single" w:sz="1" w:space="0" w:color="000000"/>
-            </w:tcBorders>
-          </w:tcPr>
-          <w:p>
-            <w:pPr>
-              <w:spacing w:lineRule="auto"/>
-            </w:pPr>
-            <w:r>
-              <w:rPr/>
-              <w:t xml:space="preserve">Cycle nominal · Q = 0 possible</w:t>
+              <w:t xml:space="preserve">Décision tactique</w:t>
+            </w:r>
+          </w:p>
+        </w:tc>
+        <w:tc>
+          <w:tcPr>
+            <w:tcBorders>
+              <w:top w:val="single" w:sz="1" w:space="0" w:color="000000"/>
+              <w:bottom w:val="single" w:sz="1" w:space="0" w:color="000000"/>
+              <w:left w:val="single" w:sz="1" w:space="0" w:color="000000"/>
+              <w:right w:val="single" w:sz="1" w:space="0" w:color="000000"/>
+            </w:tcBorders>
+          </w:tcPr>
+          <w:p>
+            <w:pPr>
+              <w:spacing w:lineRule="auto"/>
+            </w:pPr>
+            <w:r>
+              <w:rPr/>
+              <w:t xml:space="preserve">Preuves session · Q = 0 possible</w:t>
             </w:r>
           </w:p>
         </w:tc>
@@ -3451,45 +4424,45 @@
             </w:pPr>
             <w:r>
               <w:rPr/>
-              <w:t xml:space="preserve">Tactique</w:t>
-            </w:r>
-          </w:p>
-        </w:tc>
-        <w:tc>
-          <w:tcPr>
-            <w:tcBorders>
-              <w:top w:val="single" w:sz="1" w:space="0" w:color="000000"/>
-              <w:bottom w:val="single" w:sz="1" w:space="0" w:color="000000"/>
-              <w:left w:val="single" w:sz="1" w:space="0" w:color="000000"/>
-              <w:right w:val="single" w:sz="1" w:space="0" w:color="000000"/>
-            </w:tcBorders>
-          </w:tcPr>
-          <w:p>
-            <w:pPr>
-              <w:spacing w:lineRule="auto"/>
-            </w:pPr>
-            <w:r>
-              <w:rPr/>
-              <w:t xml:space="preserve">Réconcilier puis décider</w:t>
-            </w:r>
-          </w:p>
-        </w:tc>
-        <w:tc>
-          <w:tcPr>
-            <w:tcBorders>
-              <w:top w:val="single" w:sz="1" w:space="0" w:color="000000"/>
-              <w:bottom w:val="single" w:sz="1" w:space="0" w:color="000000"/>
-              <w:left w:val="single" w:sz="1" w:space="0" w:color="000000"/>
-              <w:right w:val="single" w:sz="1" w:space="0" w:color="000000"/>
-            </w:tcBorders>
-          </w:tcPr>
-          <w:p>
-            <w:pPr>
-              <w:spacing w:lineRule="auto"/>
-            </w:pPr>
-            <w:r>
-              <w:rPr/>
-              <w:t xml:space="preserve">2–4 phrases</w:t>
+              <w:t xml:space="preserve">Décision tactique après réconciliation</w:t>
+            </w:r>
+          </w:p>
+        </w:tc>
+        <w:tc>
+          <w:tcPr>
+            <w:tcBorders>
+              <w:top w:val="single" w:sz="1" w:space="0" w:color="000000"/>
+              <w:bottom w:val="single" w:sz="1" w:space="0" w:color="000000"/>
+              <w:left w:val="single" w:sz="1" w:space="0" w:color="000000"/>
+              <w:right w:val="single" w:sz="1" w:space="0" w:color="000000"/>
+            </w:tcBorders>
+          </w:tcPr>
+          <w:p>
+            <w:pPr>
+              <w:spacing w:lineRule="auto"/>
+            </w:pPr>
+            <w:r>
+              <w:rPr/>
+              <w:t xml:space="preserve">Réconcilier puis décider sur stock corrigé</w:t>
+            </w:r>
+          </w:p>
+        </w:tc>
+        <w:tc>
+          <w:tcPr>
+            <w:tcBorders>
+              <w:top w:val="single" w:sz="1" w:space="0" w:color="000000"/>
+              <w:bottom w:val="single" w:sz="1" w:space="0" w:color="000000"/>
+              <w:left w:val="single" w:sz="1" w:space="0" w:color="000000"/>
+              <w:right w:val="single" w:sz="1" w:space="0" w:color="000000"/>
+            </w:tcBorders>
+          </w:tcPr>
+          <w:p>
+            <w:pPr>
+              <w:spacing w:lineRule="auto"/>
+            </w:pPr>
+            <w:r>
+              <w:rPr/>
+              <w:t xml:space="preserve">2–3 phrases</w:t>
             </w:r>
           </w:p>
         </w:tc>
@@ -3532,26 +4505,26 @@
             </w:pPr>
             <w:r>
               <w:rPr/>
-              <w:t xml:space="preserve">Stratégique</w:t>
-            </w:r>
-          </w:p>
-        </w:tc>
-        <w:tc>
-          <w:tcPr>
-            <w:tcBorders>
-              <w:top w:val="single" w:sz="1" w:space="0" w:color="000000"/>
-              <w:bottom w:val="single" w:sz="1" w:space="0" w:color="000000"/>
-              <w:left w:val="single" w:sz="1" w:space="0" w:color="000000"/>
-              <w:right w:val="single" w:sz="1" w:space="0" w:color="000000"/>
-            </w:tcBorders>
-          </w:tcPr>
-          <w:p>
-            <w:pPr>
-              <w:spacing w:lineRule="auto"/>
-            </w:pPr>
-            <w:r>
-              <w:rPr/>
-              <w:t xml:space="preserve">Preuves session → priorité → compromis → horizon</w:t>
+              <w:t xml:space="preserve">Décision stratégique</w:t>
+            </w:r>
+          </w:p>
+        </w:tc>
+        <w:tc>
+          <w:tcPr>
+            <w:tcBorders>
+              <w:top w:val="single" w:sz="1" w:space="0" w:color="000000"/>
+              <w:bottom w:val="single" w:sz="1" w:space="0" w:color="000000"/>
+              <w:left w:val="single" w:sz="1" w:space="0" w:color="000000"/>
+              <w:right w:val="single" w:sz="1" w:space="0" w:color="000000"/>
+            </w:tcBorders>
+          </w:tcPr>
+          <w:p>
+            <w:pPr>
+              <w:spacing w:lineRule="auto"/>
+            </w:pPr>
+            <w:r>
+              <w:rPr/>
+              <w:t xml:space="preserve">Preuves → priorité → compromis → horizon</w:t>
             </w:r>
           </w:p>
         </w:tc>
@@ -3615,11 +4588,7 @@
       </w:r>
       <w:r>
         <w:rPr/>
-        <w:br w:type="textWrapping"/>
-      </w:r>
-      <w:r>
-        <w:rPr/>
-        <w:t xml:space="preserve">Compréhension des processus et séquences (POSTED/PENDING, putaway, capacité, FIFO, inventaire, ADJ, Min/Max, réappro).</w:t>
+        <w:t xml:space="preserve"> Compréhension des processus et séquences (POSTED/PENDING, putaway, capacité, FIFO, inventaire, ADJ, Min/Max, réappro).</w:t>
       </w:r>
     </w:p>
     <w:p>
@@ -3634,11 +4603,7 @@
       </w:r>
       <w:r>
         <w:rPr/>
-        <w:br w:type="textWrapping"/>
-      </w:r>
-      <w:r>
-        <w:rPr/>
-        <w:t xml:space="preserve">Interprétation KPI, distinction tactique / stratégique, snapshot de session, compromis — </w:t>
+        <w:t xml:space="preserve"> Interprétation KPI, distinction tactique / stratégique, résultats de session, compromis — </w:t>
       </w:r>
       <w:r>
         <w:rPr>
@@ -5172,8 +6137,8 @@
   <w:abstractNum w:abstractNumId="10">
     <w:lvl w:ilvl="0">
       <w:start w:val="1"/>
-      <w:numFmt w:val="bullet"/>
-      <w:lvlText w:val=""/>
+      <w:numFmt w:val="decimal"/>
+      <w:lvlText w:val="%1."/>
       <w:lvlJc w:val="left"/>
       <w:pPr>
         <w:tabs>
@@ -5181,14 +6146,11 @@
         </w:tabs>
         <w:ind w:left="720" w:hanging="360"/>
       </w:pPr>
-      <w:rPr>
-        <w:rFonts w:ascii="Symbol" w:hAnsi="Symbol" w:hint="default"/>
-      </w:rPr>
     </w:lvl>
     <w:lvl w:ilvl="1">
       <w:start w:val="1"/>
-      <w:numFmt w:val="bullet"/>
-      <w:lvlText w:val=""/>
+      <w:numFmt w:val="decimal"/>
+      <w:lvlText w:val="%2."/>
       <w:lvlJc w:val="left"/>
       <w:pPr>
         <w:tabs>
@@ -5196,14 +6158,11 @@
         </w:tabs>
         <w:ind w:left="1440" w:hanging="360"/>
       </w:pPr>
-      <w:rPr>
-        <w:rFonts w:ascii="Symbol" w:hAnsi="Symbol" w:hint="default"/>
-      </w:rPr>
     </w:lvl>
     <w:lvl w:ilvl="2">
       <w:start w:val="1"/>
-      <w:numFmt w:val="bullet"/>
-      <w:lvlText w:val=""/>
+      <w:numFmt w:val="decimal"/>
+      <w:lvlText w:val="%3."/>
       <w:lvlJc w:val="left"/>
       <w:pPr>
         <w:tabs>
@@ -5211,14 +6170,11 @@
         </w:tabs>
         <w:ind w:left="2160" w:hanging="360"/>
       </w:pPr>
-      <w:rPr>
-        <w:rFonts w:ascii="Symbol" w:hAnsi="Symbol" w:hint="default"/>
-      </w:rPr>
     </w:lvl>
     <w:lvl w:ilvl="3">
       <w:start w:val="1"/>
-      <w:numFmt w:val="bullet"/>
-      <w:lvlText w:val=""/>
+      <w:numFmt w:val="decimal"/>
+      <w:lvlText w:val="%4."/>
       <w:lvlJc w:val="left"/>
       <w:pPr>
         <w:tabs>
@@ -5226,14 +6182,11 @@
         </w:tabs>
         <w:ind w:left="2880" w:hanging="360"/>
       </w:pPr>
-      <w:rPr>
-        <w:rFonts w:ascii="Symbol" w:hAnsi="Symbol" w:hint="default"/>
-      </w:rPr>
     </w:lvl>
     <w:lvl w:ilvl="4">
       <w:start w:val="1"/>
-      <w:numFmt w:val="bullet"/>
-      <w:lvlText w:val=""/>
+      <w:numFmt w:val="decimal"/>
+      <w:lvlText w:val="%5."/>
       <w:lvlJc w:val="left"/>
       <w:pPr>
         <w:tabs>
@@ -5241,14 +6194,11 @@
         </w:tabs>
         <w:ind w:left="3600" w:hanging="360"/>
       </w:pPr>
-      <w:rPr>
-        <w:rFonts w:ascii="Symbol" w:hAnsi="Symbol" w:hint="default"/>
-      </w:rPr>
     </w:lvl>
     <w:lvl w:ilvl="5">
       <w:start w:val="1"/>
-      <w:numFmt w:val="bullet"/>
-      <w:lvlText w:val=""/>
+      <w:numFmt w:val="decimal"/>
+      <w:lvlText w:val="%6."/>
       <w:lvlJc w:val="left"/>
       <w:pPr>
         <w:tabs>
@@ -5256,14 +6206,11 @@
         </w:tabs>
         <w:ind w:left="4320" w:hanging="360"/>
       </w:pPr>
-      <w:rPr>
-        <w:rFonts w:ascii="Symbol" w:hAnsi="Symbol" w:hint="default"/>
-      </w:rPr>
     </w:lvl>
     <w:lvl w:ilvl="6">
       <w:start w:val="1"/>
-      <w:numFmt w:val="bullet"/>
-      <w:lvlText w:val=""/>
+      <w:numFmt w:val="decimal"/>
+      <w:lvlText w:val="%7."/>
       <w:lvlJc w:val="left"/>
       <w:pPr>
         <w:tabs>
@@ -5271,14 +6218,11 @@
         </w:tabs>
         <w:ind w:left="5040" w:hanging="360"/>
       </w:pPr>
-      <w:rPr>
-        <w:rFonts w:ascii="Symbol" w:hAnsi="Symbol" w:hint="default"/>
-      </w:rPr>
     </w:lvl>
     <w:lvl w:ilvl="7">
       <w:start w:val="1"/>
-      <w:numFmt w:val="bullet"/>
-      <w:lvlText w:val=""/>
+      <w:numFmt w:val="decimal"/>
+      <w:lvlText w:val="%8."/>
       <w:lvlJc w:val="left"/>
       <w:pPr>
         <w:tabs>
@@ -5286,14 +6230,377 @@
         </w:tabs>
         <w:ind w:left="5760" w:hanging="360"/>
       </w:pPr>
-      <w:rPr>
-        <w:rFonts w:ascii="Symbol" w:hAnsi="Symbol" w:hint="default"/>
-      </w:rPr>
     </w:lvl>
   </w:abstractNum>
   <w:abstractNum w:abstractNumId="11">
     <w:lvl w:ilvl="0">
       <w:start w:val="1"/>
+      <w:numFmt w:val="bullet"/>
+      <w:lvlText w:val=""/>
+      <w:lvlJc w:val="left"/>
+      <w:pPr>
+        <w:tabs>
+          <w:tab w:val="num" w:pos="720"/>
+        </w:tabs>
+        <w:ind w:left="720" w:hanging="360"/>
+      </w:pPr>
+      <w:rPr>
+        <w:rFonts w:ascii="Symbol" w:hAnsi="Symbol" w:hint="default"/>
+      </w:rPr>
+    </w:lvl>
+    <w:lvl w:ilvl="1">
+      <w:start w:val="1"/>
+      <w:numFmt w:val="bullet"/>
+      <w:lvlText w:val=""/>
+      <w:lvlJc w:val="left"/>
+      <w:pPr>
+        <w:tabs>
+          <w:tab w:val="num" w:pos="1440"/>
+        </w:tabs>
+        <w:ind w:left="1440" w:hanging="360"/>
+      </w:pPr>
+      <w:rPr>
+        <w:rFonts w:ascii="Symbol" w:hAnsi="Symbol" w:hint="default"/>
+      </w:rPr>
+    </w:lvl>
+    <w:lvl w:ilvl="2">
+      <w:start w:val="1"/>
+      <w:numFmt w:val="bullet"/>
+      <w:lvlText w:val=""/>
+      <w:lvlJc w:val="left"/>
+      <w:pPr>
+        <w:tabs>
+          <w:tab w:val="num" w:pos="2160"/>
+        </w:tabs>
+        <w:ind w:left="2160" w:hanging="360"/>
+      </w:pPr>
+      <w:rPr>
+        <w:rFonts w:ascii="Symbol" w:hAnsi="Symbol" w:hint="default"/>
+      </w:rPr>
+    </w:lvl>
+    <w:lvl w:ilvl="3">
+      <w:start w:val="1"/>
+      <w:numFmt w:val="bullet"/>
+      <w:lvlText w:val=""/>
+      <w:lvlJc w:val="left"/>
+      <w:pPr>
+        <w:tabs>
+          <w:tab w:val="num" w:pos="2880"/>
+        </w:tabs>
+        <w:ind w:left="2880" w:hanging="360"/>
+      </w:pPr>
+      <w:rPr>
+        <w:rFonts w:ascii="Symbol" w:hAnsi="Symbol" w:hint="default"/>
+      </w:rPr>
+    </w:lvl>
+    <w:lvl w:ilvl="4">
+      <w:start w:val="1"/>
+      <w:numFmt w:val="bullet"/>
+      <w:lvlText w:val=""/>
+      <w:lvlJc w:val="left"/>
+      <w:pPr>
+        <w:tabs>
+          <w:tab w:val="num" w:pos="3600"/>
+        </w:tabs>
+        <w:ind w:left="3600" w:hanging="360"/>
+      </w:pPr>
+      <w:rPr>
+        <w:rFonts w:ascii="Symbol" w:hAnsi="Symbol" w:hint="default"/>
+      </w:rPr>
+    </w:lvl>
+    <w:lvl w:ilvl="5">
+      <w:start w:val="1"/>
+      <w:numFmt w:val="bullet"/>
+      <w:lvlText w:val=""/>
+      <w:lvlJc w:val="left"/>
+      <w:pPr>
+        <w:tabs>
+          <w:tab w:val="num" w:pos="4320"/>
+        </w:tabs>
+        <w:ind w:left="4320" w:hanging="360"/>
+      </w:pPr>
+      <w:rPr>
+        <w:rFonts w:ascii="Symbol" w:hAnsi="Symbol" w:hint="default"/>
+      </w:rPr>
+    </w:lvl>
+    <w:lvl w:ilvl="6">
+      <w:start w:val="1"/>
+      <w:numFmt w:val="bullet"/>
+      <w:lvlText w:val=""/>
+      <w:lvlJc w:val="left"/>
+      <w:pPr>
+        <w:tabs>
+          <w:tab w:val="num" w:pos="5040"/>
+        </w:tabs>
+        <w:ind w:left="5040" w:hanging="360"/>
+      </w:pPr>
+      <w:rPr>
+        <w:rFonts w:ascii="Symbol" w:hAnsi="Symbol" w:hint="default"/>
+      </w:rPr>
+    </w:lvl>
+    <w:lvl w:ilvl="7">
+      <w:start w:val="1"/>
+      <w:numFmt w:val="bullet"/>
+      <w:lvlText w:val=""/>
+      <w:lvlJc w:val="left"/>
+      <w:pPr>
+        <w:tabs>
+          <w:tab w:val="num" w:pos="5760"/>
+        </w:tabs>
+        <w:ind w:left="5760" w:hanging="360"/>
+      </w:pPr>
+      <w:rPr>
+        <w:rFonts w:ascii="Symbol" w:hAnsi="Symbol" w:hint="default"/>
+      </w:rPr>
+    </w:lvl>
+  </w:abstractNum>
+  <w:abstractNum w:abstractNumId="12">
+    <w:lvl w:ilvl="0">
+      <w:start w:val="1"/>
+      <w:numFmt w:val="bullet"/>
+      <w:lvlText w:val=""/>
+      <w:lvlJc w:val="left"/>
+      <w:pPr>
+        <w:tabs>
+          <w:tab w:val="num" w:pos="720"/>
+        </w:tabs>
+        <w:ind w:left="720" w:hanging="360"/>
+      </w:pPr>
+      <w:rPr>
+        <w:rFonts w:ascii="Symbol" w:hAnsi="Symbol" w:hint="default"/>
+      </w:rPr>
+    </w:lvl>
+    <w:lvl w:ilvl="1">
+      <w:start w:val="1"/>
+      <w:numFmt w:val="bullet"/>
+      <w:lvlText w:val=""/>
+      <w:lvlJc w:val="left"/>
+      <w:pPr>
+        <w:tabs>
+          <w:tab w:val="num" w:pos="1440"/>
+        </w:tabs>
+        <w:ind w:left="1440" w:hanging="360"/>
+      </w:pPr>
+      <w:rPr>
+        <w:rFonts w:ascii="Symbol" w:hAnsi="Symbol" w:hint="default"/>
+      </w:rPr>
+    </w:lvl>
+    <w:lvl w:ilvl="2">
+      <w:start w:val="1"/>
+      <w:numFmt w:val="bullet"/>
+      <w:lvlText w:val=""/>
+      <w:lvlJc w:val="left"/>
+      <w:pPr>
+        <w:tabs>
+          <w:tab w:val="num" w:pos="2160"/>
+        </w:tabs>
+        <w:ind w:left="2160" w:hanging="360"/>
+      </w:pPr>
+      <w:rPr>
+        <w:rFonts w:ascii="Symbol" w:hAnsi="Symbol" w:hint="default"/>
+      </w:rPr>
+    </w:lvl>
+    <w:lvl w:ilvl="3">
+      <w:start w:val="1"/>
+      <w:numFmt w:val="bullet"/>
+      <w:lvlText w:val=""/>
+      <w:lvlJc w:val="left"/>
+      <w:pPr>
+        <w:tabs>
+          <w:tab w:val="num" w:pos="2880"/>
+        </w:tabs>
+        <w:ind w:left="2880" w:hanging="360"/>
+      </w:pPr>
+      <w:rPr>
+        <w:rFonts w:ascii="Symbol" w:hAnsi="Symbol" w:hint="default"/>
+      </w:rPr>
+    </w:lvl>
+    <w:lvl w:ilvl="4">
+      <w:start w:val="1"/>
+      <w:numFmt w:val="bullet"/>
+      <w:lvlText w:val=""/>
+      <w:lvlJc w:val="left"/>
+      <w:pPr>
+        <w:tabs>
+          <w:tab w:val="num" w:pos="3600"/>
+        </w:tabs>
+        <w:ind w:left="3600" w:hanging="360"/>
+      </w:pPr>
+      <w:rPr>
+        <w:rFonts w:ascii="Symbol" w:hAnsi="Symbol" w:hint="default"/>
+      </w:rPr>
+    </w:lvl>
+    <w:lvl w:ilvl="5">
+      <w:start w:val="1"/>
+      <w:numFmt w:val="bullet"/>
+      <w:lvlText w:val=""/>
+      <w:lvlJc w:val="left"/>
+      <w:pPr>
+        <w:tabs>
+          <w:tab w:val="num" w:pos="4320"/>
+        </w:tabs>
+        <w:ind w:left="4320" w:hanging="360"/>
+      </w:pPr>
+      <w:rPr>
+        <w:rFonts w:ascii="Symbol" w:hAnsi="Symbol" w:hint="default"/>
+      </w:rPr>
+    </w:lvl>
+    <w:lvl w:ilvl="6">
+      <w:start w:val="1"/>
+      <w:numFmt w:val="bullet"/>
+      <w:lvlText w:val=""/>
+      <w:lvlJc w:val="left"/>
+      <w:pPr>
+        <w:tabs>
+          <w:tab w:val="num" w:pos="5040"/>
+        </w:tabs>
+        <w:ind w:left="5040" w:hanging="360"/>
+      </w:pPr>
+      <w:rPr>
+        <w:rFonts w:ascii="Symbol" w:hAnsi="Symbol" w:hint="default"/>
+      </w:rPr>
+    </w:lvl>
+    <w:lvl w:ilvl="7">
+      <w:start w:val="1"/>
+      <w:numFmt w:val="bullet"/>
+      <w:lvlText w:val=""/>
+      <w:lvlJc w:val="left"/>
+      <w:pPr>
+        <w:tabs>
+          <w:tab w:val="num" w:pos="5760"/>
+        </w:tabs>
+        <w:ind w:left="5760" w:hanging="360"/>
+      </w:pPr>
+      <w:rPr>
+        <w:rFonts w:ascii="Symbol" w:hAnsi="Symbol" w:hint="default"/>
+      </w:rPr>
+    </w:lvl>
+  </w:abstractNum>
+  <w:abstractNum w:abstractNumId="13">
+    <w:lvl w:ilvl="0">
+      <w:start w:val="1"/>
+      <w:numFmt w:val="bullet"/>
+      <w:lvlText w:val=""/>
+      <w:lvlJc w:val="left"/>
+      <w:pPr>
+        <w:tabs>
+          <w:tab w:val="num" w:pos="720"/>
+        </w:tabs>
+        <w:ind w:left="720" w:hanging="360"/>
+      </w:pPr>
+      <w:rPr>
+        <w:rFonts w:ascii="Symbol" w:hAnsi="Symbol" w:hint="default"/>
+      </w:rPr>
+    </w:lvl>
+    <w:lvl w:ilvl="1">
+      <w:start w:val="1"/>
+      <w:numFmt w:val="bullet"/>
+      <w:lvlText w:val=""/>
+      <w:lvlJc w:val="left"/>
+      <w:pPr>
+        <w:tabs>
+          <w:tab w:val="num" w:pos="1440"/>
+        </w:tabs>
+        <w:ind w:left="1440" w:hanging="360"/>
+      </w:pPr>
+      <w:rPr>
+        <w:rFonts w:ascii="Symbol" w:hAnsi="Symbol" w:hint="default"/>
+      </w:rPr>
+    </w:lvl>
+    <w:lvl w:ilvl="2">
+      <w:start w:val="1"/>
+      <w:numFmt w:val="bullet"/>
+      <w:lvlText w:val=""/>
+      <w:lvlJc w:val="left"/>
+      <w:pPr>
+        <w:tabs>
+          <w:tab w:val="num" w:pos="2160"/>
+        </w:tabs>
+        <w:ind w:left="2160" w:hanging="360"/>
+      </w:pPr>
+      <w:rPr>
+        <w:rFonts w:ascii="Symbol" w:hAnsi="Symbol" w:hint="default"/>
+      </w:rPr>
+    </w:lvl>
+    <w:lvl w:ilvl="3">
+      <w:start w:val="1"/>
+      <w:numFmt w:val="bullet"/>
+      <w:lvlText w:val=""/>
+      <w:lvlJc w:val="left"/>
+      <w:pPr>
+        <w:tabs>
+          <w:tab w:val="num" w:pos="2880"/>
+        </w:tabs>
+        <w:ind w:left="2880" w:hanging="360"/>
+      </w:pPr>
+      <w:rPr>
+        <w:rFonts w:ascii="Symbol" w:hAnsi="Symbol" w:hint="default"/>
+      </w:rPr>
+    </w:lvl>
+    <w:lvl w:ilvl="4">
+      <w:start w:val="1"/>
+      <w:numFmt w:val="bullet"/>
+      <w:lvlText w:val=""/>
+      <w:lvlJc w:val="left"/>
+      <w:pPr>
+        <w:tabs>
+          <w:tab w:val="num" w:pos="3600"/>
+        </w:tabs>
+        <w:ind w:left="3600" w:hanging="360"/>
+      </w:pPr>
+      <w:rPr>
+        <w:rFonts w:ascii="Symbol" w:hAnsi="Symbol" w:hint="default"/>
+      </w:rPr>
+    </w:lvl>
+    <w:lvl w:ilvl="5">
+      <w:start w:val="1"/>
+      <w:numFmt w:val="bullet"/>
+      <w:lvlText w:val=""/>
+      <w:lvlJc w:val="left"/>
+      <w:pPr>
+        <w:tabs>
+          <w:tab w:val="num" w:pos="4320"/>
+        </w:tabs>
+        <w:ind w:left="4320" w:hanging="360"/>
+      </w:pPr>
+      <w:rPr>
+        <w:rFonts w:ascii="Symbol" w:hAnsi="Symbol" w:hint="default"/>
+      </w:rPr>
+    </w:lvl>
+    <w:lvl w:ilvl="6">
+      <w:start w:val="1"/>
+      <w:numFmt w:val="bullet"/>
+      <w:lvlText w:val=""/>
+      <w:lvlJc w:val="left"/>
+      <w:pPr>
+        <w:tabs>
+          <w:tab w:val="num" w:pos="5040"/>
+        </w:tabs>
+        <w:ind w:left="5040" w:hanging="360"/>
+      </w:pPr>
+      <w:rPr>
+        <w:rFonts w:ascii="Symbol" w:hAnsi="Symbol" w:hint="default"/>
+      </w:rPr>
+    </w:lvl>
+    <w:lvl w:ilvl="7">
+      <w:start w:val="1"/>
+      <w:numFmt w:val="bullet"/>
+      <w:lvlText w:val=""/>
+      <w:lvlJc w:val="left"/>
+      <w:pPr>
+        <w:tabs>
+          <w:tab w:val="num" w:pos="5760"/>
+        </w:tabs>
+        <w:ind w:left="5760" w:hanging="360"/>
+      </w:pPr>
+      <w:rPr>
+        <w:rFonts w:ascii="Symbol" w:hAnsi="Symbol" w:hint="default"/>
+      </w:rPr>
+    </w:lvl>
+  </w:abstractNum>
+  <w:abstractNum w:abstractNumId="14">
+    <w:lvl w:ilvl="0">
+      <w:start w:val="1"/>
       <w:numFmt w:val="decimal"/>
       <w:lvlText w:val="%1."/>
       <w:lvlJc w:val="left"/>
@@ -5389,7 +6696,227 @@
       </w:pPr>
     </w:lvl>
   </w:abstractNum>
-  <w:abstractNum w:abstractNumId="12">
+  <w:abstractNum w:abstractNumId="15">
+    <w:lvl w:ilvl="0">
+      <w:start w:val="1"/>
+      <w:numFmt w:val="bullet"/>
+      <w:lvlText w:val=""/>
+      <w:lvlJc w:val="left"/>
+      <w:pPr>
+        <w:tabs>
+          <w:tab w:val="num" w:pos="720"/>
+        </w:tabs>
+        <w:ind w:left="720" w:hanging="360"/>
+      </w:pPr>
+      <w:rPr>
+        <w:rFonts w:ascii="Symbol" w:hAnsi="Symbol" w:hint="default"/>
+      </w:rPr>
+    </w:lvl>
+    <w:lvl w:ilvl="1">
+      <w:start w:val="1"/>
+      <w:numFmt w:val="bullet"/>
+      <w:lvlText w:val=""/>
+      <w:lvlJc w:val="left"/>
+      <w:pPr>
+        <w:tabs>
+          <w:tab w:val="num" w:pos="1440"/>
+        </w:tabs>
+        <w:ind w:left="1440" w:hanging="360"/>
+      </w:pPr>
+      <w:rPr>
+        <w:rFonts w:ascii="Symbol" w:hAnsi="Symbol" w:hint="default"/>
+      </w:rPr>
+    </w:lvl>
+    <w:lvl w:ilvl="2">
+      <w:start w:val="1"/>
+      <w:numFmt w:val="bullet"/>
+      <w:lvlText w:val=""/>
+      <w:lvlJc w:val="left"/>
+      <w:pPr>
+        <w:tabs>
+          <w:tab w:val="num" w:pos="2160"/>
+        </w:tabs>
+        <w:ind w:left="2160" w:hanging="360"/>
+      </w:pPr>
+      <w:rPr>
+        <w:rFonts w:ascii="Symbol" w:hAnsi="Symbol" w:hint="default"/>
+      </w:rPr>
+    </w:lvl>
+    <w:lvl w:ilvl="3">
+      <w:start w:val="1"/>
+      <w:numFmt w:val="bullet"/>
+      <w:lvlText w:val=""/>
+      <w:lvlJc w:val="left"/>
+      <w:pPr>
+        <w:tabs>
+          <w:tab w:val="num" w:pos="2880"/>
+        </w:tabs>
+        <w:ind w:left="2880" w:hanging="360"/>
+      </w:pPr>
+      <w:rPr>
+        <w:rFonts w:ascii="Symbol" w:hAnsi="Symbol" w:hint="default"/>
+      </w:rPr>
+    </w:lvl>
+    <w:lvl w:ilvl="4">
+      <w:start w:val="1"/>
+      <w:numFmt w:val="bullet"/>
+      <w:lvlText w:val=""/>
+      <w:lvlJc w:val="left"/>
+      <w:pPr>
+        <w:tabs>
+          <w:tab w:val="num" w:pos="3600"/>
+        </w:tabs>
+        <w:ind w:left="3600" w:hanging="360"/>
+      </w:pPr>
+      <w:rPr>
+        <w:rFonts w:ascii="Symbol" w:hAnsi="Symbol" w:hint="default"/>
+      </w:rPr>
+    </w:lvl>
+    <w:lvl w:ilvl="5">
+      <w:start w:val="1"/>
+      <w:numFmt w:val="bullet"/>
+      <w:lvlText w:val=""/>
+      <w:lvlJc w:val="left"/>
+      <w:pPr>
+        <w:tabs>
+          <w:tab w:val="num" w:pos="4320"/>
+        </w:tabs>
+        <w:ind w:left="4320" w:hanging="360"/>
+      </w:pPr>
+      <w:rPr>
+        <w:rFonts w:ascii="Symbol" w:hAnsi="Symbol" w:hint="default"/>
+      </w:rPr>
+    </w:lvl>
+    <w:lvl w:ilvl="6">
+      <w:start w:val="1"/>
+      <w:numFmt w:val="bullet"/>
+      <w:lvlText w:val=""/>
+      <w:lvlJc w:val="left"/>
+      <w:pPr>
+        <w:tabs>
+          <w:tab w:val="num" w:pos="5040"/>
+        </w:tabs>
+        <w:ind w:left="5040" w:hanging="360"/>
+      </w:pPr>
+      <w:rPr>
+        <w:rFonts w:ascii="Symbol" w:hAnsi="Symbol" w:hint="default"/>
+      </w:rPr>
+    </w:lvl>
+    <w:lvl w:ilvl="7">
+      <w:start w:val="1"/>
+      <w:numFmt w:val="bullet"/>
+      <w:lvlText w:val=""/>
+      <w:lvlJc w:val="left"/>
+      <w:pPr>
+        <w:tabs>
+          <w:tab w:val="num" w:pos="5760"/>
+        </w:tabs>
+        <w:ind w:left="5760" w:hanging="360"/>
+      </w:pPr>
+      <w:rPr>
+        <w:rFonts w:ascii="Symbol" w:hAnsi="Symbol" w:hint="default"/>
+      </w:rPr>
+    </w:lvl>
+  </w:abstractNum>
+  <w:abstractNum w:abstractNumId="16">
+    <w:lvl w:ilvl="0">
+      <w:start w:val="1"/>
+      <w:numFmt w:val="decimal"/>
+      <w:lvlText w:val="%1."/>
+      <w:lvlJc w:val="left"/>
+      <w:pPr>
+        <w:tabs>
+          <w:tab w:val="num" w:pos="720"/>
+        </w:tabs>
+        <w:ind w:left="720" w:hanging="360"/>
+      </w:pPr>
+    </w:lvl>
+    <w:lvl w:ilvl="1">
+      <w:start w:val="1"/>
+      <w:numFmt w:val="decimal"/>
+      <w:lvlText w:val="%2."/>
+      <w:lvlJc w:val="left"/>
+      <w:pPr>
+        <w:tabs>
+          <w:tab w:val="num" w:pos="1440"/>
+        </w:tabs>
+        <w:ind w:left="1440" w:hanging="360"/>
+      </w:pPr>
+    </w:lvl>
+    <w:lvl w:ilvl="2">
+      <w:start w:val="1"/>
+      <w:numFmt w:val="decimal"/>
+      <w:lvlText w:val="%3."/>
+      <w:lvlJc w:val="left"/>
+      <w:pPr>
+        <w:tabs>
+          <w:tab w:val="num" w:pos="2160"/>
+        </w:tabs>
+        <w:ind w:left="2160" w:hanging="360"/>
+      </w:pPr>
+    </w:lvl>
+    <w:lvl w:ilvl="3">
+      <w:start w:val="1"/>
+      <w:numFmt w:val="decimal"/>
+      <w:lvlText w:val="%4."/>
+      <w:lvlJc w:val="left"/>
+      <w:pPr>
+        <w:tabs>
+          <w:tab w:val="num" w:pos="2880"/>
+        </w:tabs>
+        <w:ind w:left="2880" w:hanging="360"/>
+      </w:pPr>
+    </w:lvl>
+    <w:lvl w:ilvl="4">
+      <w:start w:val="1"/>
+      <w:numFmt w:val="decimal"/>
+      <w:lvlText w:val="%5."/>
+      <w:lvlJc w:val="left"/>
+      <w:pPr>
+        <w:tabs>
+          <w:tab w:val="num" w:pos="3600"/>
+        </w:tabs>
+        <w:ind w:left="3600" w:hanging="360"/>
+      </w:pPr>
+    </w:lvl>
+    <w:lvl w:ilvl="5">
+      <w:start w:val="1"/>
+      <w:numFmt w:val="decimal"/>
+      <w:lvlText w:val="%6."/>
+      <w:lvlJc w:val="left"/>
+      <w:pPr>
+        <w:tabs>
+          <w:tab w:val="num" w:pos="4320"/>
+        </w:tabs>
+        <w:ind w:left="4320" w:hanging="360"/>
+      </w:pPr>
+    </w:lvl>
+    <w:lvl w:ilvl="6">
+      <w:start w:val="1"/>
+      <w:numFmt w:val="decimal"/>
+      <w:lvlText w:val="%7."/>
+      <w:lvlJc w:val="left"/>
+      <w:pPr>
+        <w:tabs>
+          <w:tab w:val="num" w:pos="5040"/>
+        </w:tabs>
+        <w:ind w:left="5040" w:hanging="360"/>
+      </w:pPr>
+    </w:lvl>
+    <w:lvl w:ilvl="7">
+      <w:start w:val="1"/>
+      <w:numFmt w:val="decimal"/>
+      <w:lvlText w:val="%8."/>
+      <w:lvlJc w:val="left"/>
+      <w:pPr>
+        <w:tabs>
+          <w:tab w:val="num" w:pos="5760"/>
+        </w:tabs>
+        <w:ind w:left="5760" w:hanging="360"/>
+      </w:pPr>
+    </w:lvl>
+  </w:abstractNum>
+  <w:abstractNum w:abstractNumId="17">
     <w:lvl w:ilvl="0">
       <w:start w:val="1"/>
       <w:numFmt w:val="bullet"/>
@@ -5546,6 +7073,21 @@
   </w:num>
   <w:num w:numId="12">
     <w:abstractNumId w:val="12"/>
+  </w:num>
+  <w:num w:numId="13">
+    <w:abstractNumId w:val="13"/>
+  </w:num>
+  <w:num w:numId="14">
+    <w:abstractNumId w:val="14"/>
+  </w:num>
+  <w:num w:numId="15">
+    <w:abstractNumId w:val="15"/>
+  </w:num>
+  <w:num w:numId="16">
+    <w:abstractNumId w:val="16"/>
+  </w:num>
+  <w:num w:numId="17">
+    <w:abstractNumId w:val="17"/>
   </w:num>
 </w:numbering>
 </file>

</xml_diff>